<commit_message>
Edits to Score and Front Matter Piece 1-3
</commit_message>
<xml_diff>
--- a/Front Matter/Template/1_Front-Matter.docx
+++ b/Front Matter/Template/1_Front-Matter.docx
@@ -2782,7 +2782,16 @@
           <w:szCs w:val="24"/>
           <w:lang w:val="en-US"/>
         </w:rPr>
-        <w:t xml:space="preserve">1 </w:t>
+        <w:t>2</w:t>
+      </w:r>
+      <w:r>
+        <w:rPr>
+          <w:rFonts w:ascii="Noto Serif SC" w:eastAsia="Noto Serif SC" w:hAnsi="Noto Serif SC" w:cs="Noto Serif"/>
+          <w:sz w:val="24"/>
+          <w:szCs w:val="24"/>
+          <w:lang w:val="en-US"/>
+        </w:rPr>
+        <w:t xml:space="preserve"> </w:t>
       </w:r>
       <w:r>
         <w:rPr>
@@ -2799,7 +2808,25 @@
           <w:szCs w:val="24"/>
           <w:lang w:val="en-US"/>
         </w:rPr>
-        <w:t xml:space="preserve"> Guzheng</w:t>
+        <w:t xml:space="preserve"> </w:t>
+      </w:r>
+      <w:r>
+        <w:rPr>
+          <w:rFonts w:ascii="Noto Serif SC" w:eastAsia="Noto Serif SC" w:hAnsi="Noto Serif SC" w:cs="Noto Serif"/>
+          <w:sz w:val="24"/>
+          <w:szCs w:val="24"/>
+          <w:lang w:val="en-US"/>
+        </w:rPr>
+        <w:t xml:space="preserve">2 </w:t>
+      </w:r>
+      <w:r>
+        <w:rPr>
+          <w:rFonts w:ascii="Noto Serif SC" w:eastAsia="Noto Serif SC" w:hAnsi="Noto Serif SC" w:cs="Noto Serif"/>
+          <w:sz w:val="24"/>
+          <w:szCs w:val="24"/>
+          <w:lang w:val="en-US"/>
+        </w:rPr>
+        <w:t>Guzheng</w:t>
       </w:r>
     </w:p>
     <w:p>
@@ -3353,6 +3380,61 @@
           <w:lang w:val="en-US"/>
         </w:rPr>
         <w:t xml:space="preserve"> Erhu</w:t>
+      </w:r>
+      <w:r>
+        <w:rPr>
+          <w:rFonts w:ascii="Noto Serif SC" w:eastAsia="Noto Serif SC" w:hAnsi="Noto Serif SC" w:cs="Noto Serif"/>
+          <w:sz w:val="24"/>
+          <w:szCs w:val="24"/>
+          <w:lang w:val="en-US"/>
+        </w:rPr>
+        <w:t xml:space="preserve"> I</w:t>
+      </w:r>
+    </w:p>
+    <w:p>
+      <w:pPr>
+        <w:rPr>
+          <w:rFonts w:ascii="Noto Serif SC" w:eastAsia="Noto Serif SC" w:hAnsi="Noto Serif SC" w:cs="Noto Serif"/>
+          <w:sz w:val="24"/>
+          <w:szCs w:val="24"/>
+          <w:lang w:val="en-US"/>
+        </w:rPr>
+      </w:pPr>
+      <w:r>
+        <w:rPr>
+          <w:rFonts w:ascii="Noto Serif SC" w:eastAsia="Noto Serif SC" w:hAnsi="Noto Serif SC" w:cs="Noto Serif" w:hint="eastAsia"/>
+          <w:sz w:val="24"/>
+          <w:szCs w:val="24"/>
+          <w:lang w:val="en-US"/>
+        </w:rPr>
+        <w:t>二胡</w:t>
+      </w:r>
+      <w:r>
+        <w:rPr>
+          <w:rFonts w:ascii="Noto Serif SC" w:eastAsia="Noto Serif SC" w:hAnsi="Noto Serif SC" w:cs="Noto Serif"/>
+          <w:sz w:val="24"/>
+          <w:szCs w:val="24"/>
+          <w:lang w:val="en-US"/>
+        </w:rPr>
+        <w:t xml:space="preserve"> Erhu</w:t>
+      </w:r>
+      <w:r>
+        <w:rPr>
+          <w:rFonts w:ascii="Noto Serif SC" w:eastAsia="Noto Serif SC" w:hAnsi="Noto Serif SC" w:cs="Noto Serif"/>
+          <w:sz w:val="24"/>
+          <w:szCs w:val="24"/>
+          <w:lang w:val="en-US"/>
+        </w:rPr>
+        <w:t xml:space="preserve"> I</w:t>
+      </w:r>
+      <w:r>
+        <w:rPr>
+          <w:rFonts w:ascii="Noto Serif SC" w:eastAsia="Noto Serif SC" w:hAnsi="Noto Serif SC" w:cs="Noto Serif"/>
+          <w:sz w:val="24"/>
+          <w:szCs w:val="24"/>
+          <w:lang w:val="en-US"/>
+        </w:rPr>
+        <w:t>I</w:t>
       </w:r>
     </w:p>
     <w:p>
@@ -4170,6 +4252,7 @@
   <w:style w:type="character" w:default="1" w:styleId="DefaultParagraphFont">
     <w:name w:val="Default Paragraph Font"/>
     <w:uiPriority w:val="1"/>
+    <w:semiHidden/>
     <w:unhideWhenUsed/>
   </w:style>
   <w:style w:type="table" w:default="1" w:styleId="TableNormal">

</xml_diff>

<commit_message>
Front matter and piece 7 and 9 checked
</commit_message>
<xml_diff>
--- a/Front Matter/Template/1_Front-Matter.docx
+++ b/Front Matter/Template/1_Front-Matter.docx
@@ -2175,6 +2175,61 @@
         </w:rPr>
         <w:t xml:space="preserve">1 </w:t>
       </w:r>
+      <w:r>
+        <w:rPr>
+          <w:rFonts w:ascii="Noto Serif SC" w:eastAsia="Noto Serif SC" w:hAnsi="Noto Serif SC" w:cs="Noto Serif"/>
+          <w:sz w:val="24"/>
+          <w:szCs w:val="24"/>
+          <w:lang w:val="en-GB"/>
+        </w:rPr>
+        <w:t>Diyin Sheng</w:t>
+      </w:r>
+    </w:p>
+    <w:p>
+      <w:pPr>
+        <w:rPr>
+          <w:rFonts w:ascii="Noto Serif SC" w:eastAsia="Noto Serif SC" w:hAnsi="Noto Serif SC" w:cs="Noto Serif"/>
+          <w:sz w:val="24"/>
+          <w:szCs w:val="24"/>
+          <w:lang w:val="en-GB"/>
+        </w:rPr>
+      </w:pPr>
+      <w:r>
+        <w:rPr>
+          <w:rFonts w:ascii="Noto Serif SC" w:eastAsia="Noto Serif SC" w:hAnsi="Noto Serif SC" w:cs="Noto Serif"/>
+          <w:sz w:val="24"/>
+          <w:szCs w:val="24"/>
+          <w:lang w:val="en-GB"/>
+        </w:rPr>
+        <w:t xml:space="preserve">2 </w:t>
+      </w:r>
+      <w:r>
+        <w:rPr>
+          <w:rFonts w:ascii="Noto Serif SC" w:eastAsia="Noto Serif SC" w:hAnsi="Noto Serif SC" w:cs="Noto Serif" w:hint="eastAsia"/>
+          <w:sz w:val="24"/>
+          <w:szCs w:val="24"/>
+          <w:lang w:val="en-GB"/>
+        </w:rPr>
+        <w:t>高音唢</w:t>
+      </w:r>
+      <w:r>
+        <w:rPr>
+          <w:rFonts w:ascii="Noto Serif SC" w:eastAsia="Noto Serif SC" w:hAnsi="Noto Serif SC" w:cs="Noto Serif" w:hint="eastAsia"/>
+          <w:sz w:val="24"/>
+          <w:szCs w:val="24"/>
+          <w:lang w:val="en-US"/>
+        </w:rPr>
+        <w:t>吶</w:t>
+      </w:r>
+      <w:r>
+        <w:rPr>
+          <w:rFonts w:ascii="Noto Serif SC" w:eastAsia="Noto Serif SC" w:hAnsi="Noto Serif SC" w:cs="Noto Serif"/>
+          <w:sz w:val="24"/>
+          <w:szCs w:val="24"/>
+          <w:lang w:val="en-GB"/>
+        </w:rPr>
+        <w:t xml:space="preserve">2 </w:t>
+      </w:r>
       <w:proofErr w:type="spellStart"/>
       <w:r>
         <w:rPr>
@@ -2183,7 +2238,7 @@
           <w:szCs w:val="24"/>
           <w:lang w:val="en-GB"/>
         </w:rPr>
-        <w:t>Diyin</w:t>
+        <w:t>Gaoyin</w:t>
       </w:r>
       <w:proofErr w:type="spellEnd"/>
       <w:r>
@@ -2193,51 +2248,332 @@
           <w:szCs w:val="24"/>
           <w:lang w:val="en-GB"/>
         </w:rPr>
-        <w:t xml:space="preserve"> Sheng</w:t>
-      </w:r>
-    </w:p>
-    <w:p>
-      <w:pPr>
-        <w:rPr>
-          <w:rFonts w:ascii="Noto Serif SC" w:eastAsia="Noto Serif SC" w:hAnsi="Noto Serif SC" w:cs="Noto Serif"/>
-          <w:sz w:val="24"/>
-          <w:szCs w:val="24"/>
-          <w:lang w:val="en-GB"/>
-        </w:rPr>
-      </w:pPr>
-      <w:r>
-        <w:rPr>
-          <w:rFonts w:ascii="Noto Serif SC" w:eastAsia="Noto Serif SC" w:hAnsi="Noto Serif SC" w:cs="Noto Serif"/>
-          <w:sz w:val="24"/>
-          <w:szCs w:val="24"/>
-          <w:lang w:val="en-GB"/>
+        <w:t xml:space="preserve"> </w:t>
+      </w:r>
+      <w:proofErr w:type="spellStart"/>
+      <w:r>
+        <w:rPr>
+          <w:rFonts w:ascii="Noto Serif SC" w:eastAsia="Noto Serif SC" w:hAnsi="Noto Serif SC" w:cs="Noto Serif"/>
+          <w:sz w:val="24"/>
+          <w:szCs w:val="24"/>
+          <w:lang w:val="en-GB"/>
+        </w:rPr>
+        <w:t>Suona</w:t>
+      </w:r>
+      <w:proofErr w:type="spellEnd"/>
+    </w:p>
+    <w:p>
+      <w:pPr>
+        <w:rPr>
+          <w:rFonts w:ascii="Noto Serif SC" w:eastAsia="Noto Serif SC" w:hAnsi="Noto Serif SC" w:cs="Noto Serif"/>
+          <w:sz w:val="24"/>
+          <w:szCs w:val="24"/>
+          <w:lang w:val="en-US"/>
+        </w:rPr>
+      </w:pPr>
+      <w:r>
+        <w:rPr>
+          <w:rFonts w:ascii="Noto Serif SC" w:eastAsia="Noto Serif SC" w:hAnsi="Noto Serif SC" w:cs="Noto Serif"/>
+          <w:sz w:val="24"/>
+          <w:szCs w:val="24"/>
+          <w:lang w:val="en-US"/>
+        </w:rPr>
+        <w:t>1</w:t>
+      </w:r>
+      <w:r>
+        <w:rPr>
+          <w:rFonts w:ascii="Noto Serif SC" w:eastAsia="Noto Serif SC" w:hAnsi="Noto Serif SC" w:cs="Noto Serif" w:hint="eastAsia"/>
+          <w:sz w:val="24"/>
+          <w:szCs w:val="24"/>
+          <w:lang w:val="en-US"/>
+        </w:rPr>
+        <w:t>中音唢吶</w:t>
+      </w:r>
+      <w:r>
+        <w:rPr>
+          <w:rFonts w:ascii="Noto Serif SC" w:eastAsia="Noto Serif SC" w:hAnsi="Noto Serif SC" w:cs="Noto Serif"/>
+          <w:sz w:val="24"/>
+          <w:szCs w:val="24"/>
+          <w:lang w:val="en-US"/>
+        </w:rPr>
+        <w:t xml:space="preserve"> </w:t>
+      </w:r>
+      <w:proofErr w:type="spellStart"/>
+      <w:r>
+        <w:rPr>
+          <w:rFonts w:ascii="Noto Serif SC" w:eastAsia="Noto Serif SC" w:hAnsi="Noto Serif SC" w:cs="Noto Serif"/>
+          <w:sz w:val="24"/>
+          <w:szCs w:val="24"/>
+          <w:lang w:val="en-US"/>
+        </w:rPr>
+        <w:t>Zhongyin</w:t>
+      </w:r>
+      <w:proofErr w:type="spellEnd"/>
+      <w:r>
+        <w:rPr>
+          <w:rFonts w:ascii="Noto Serif SC" w:eastAsia="Noto Serif SC" w:hAnsi="Noto Serif SC" w:cs="Noto Serif"/>
+          <w:sz w:val="24"/>
+          <w:szCs w:val="24"/>
+          <w:lang w:val="en-US"/>
+        </w:rPr>
+        <w:t xml:space="preserve"> </w:t>
+      </w:r>
+      <w:proofErr w:type="spellStart"/>
+      <w:r>
+        <w:rPr>
+          <w:rFonts w:ascii="Noto Serif SC" w:eastAsia="Noto Serif SC" w:hAnsi="Noto Serif SC" w:cs="Noto Serif"/>
+          <w:sz w:val="24"/>
+          <w:szCs w:val="24"/>
+          <w:lang w:val="en-US"/>
+        </w:rPr>
+        <w:t>Suona</w:t>
+      </w:r>
+      <w:proofErr w:type="spellEnd"/>
+    </w:p>
+    <w:p>
+      <w:pPr>
+        <w:rPr>
+          <w:rFonts w:ascii="Noto Serif SC" w:eastAsia="Noto Serif SC" w:hAnsi="Noto Serif SC" w:cs="Noto Serif"/>
+          <w:sz w:val="24"/>
+          <w:szCs w:val="24"/>
+          <w:lang w:val="en-US"/>
+        </w:rPr>
+      </w:pPr>
+      <w:r>
+        <w:rPr>
+          <w:rFonts w:ascii="Noto Serif SC" w:eastAsia="Noto Serif SC" w:hAnsi="Noto Serif SC" w:cs="Noto Serif"/>
+          <w:sz w:val="24"/>
+          <w:szCs w:val="24"/>
+          <w:lang w:val="en-US"/>
+        </w:rPr>
+        <w:t>1</w:t>
+      </w:r>
+      <w:r>
+        <w:rPr>
+          <w:rFonts w:ascii="Noto Serif SC" w:eastAsia="Noto Serif SC" w:hAnsi="Noto Serif SC" w:cs="Noto Serif" w:hint="eastAsia"/>
+          <w:sz w:val="24"/>
+          <w:szCs w:val="24"/>
+          <w:lang w:val="en-US"/>
+        </w:rPr>
+        <w:t>次中唢吶</w:t>
+      </w:r>
+      <w:r>
+        <w:rPr>
+          <w:rFonts w:ascii="Noto Serif SC" w:eastAsia="Noto Serif SC" w:hAnsi="Noto Serif SC" w:cs="Noto Serif"/>
+          <w:sz w:val="24"/>
+          <w:szCs w:val="24"/>
+          <w:lang w:val="en-US"/>
+        </w:rPr>
+        <w:t xml:space="preserve"> </w:t>
+      </w:r>
+      <w:r>
+        <w:rPr>
+          <w:rFonts w:ascii="Noto Serif SC" w:eastAsia="Noto Serif SC" w:hAnsi="Noto Serif SC" w:cs="Noto Serif"/>
+          <w:sz w:val="24"/>
+          <w:szCs w:val="24"/>
+          <w:lang w:val="en-US"/>
+        </w:rPr>
+        <w:t xml:space="preserve">1 </w:t>
+      </w:r>
+      <w:proofErr w:type="spellStart"/>
+      <w:r>
+        <w:rPr>
+          <w:rFonts w:ascii="Noto Serif SC" w:eastAsia="Noto Serif SC" w:hAnsi="Noto Serif SC" w:cs="Noto Serif"/>
+          <w:sz w:val="24"/>
+          <w:szCs w:val="24"/>
+        </w:rPr>
+        <w:t>Cizhongyin</w:t>
+      </w:r>
+      <w:proofErr w:type="spellEnd"/>
+      <w:r>
+        <w:rPr>
+          <w:rFonts w:ascii="Noto Serif SC" w:eastAsia="Noto Serif SC" w:hAnsi="Noto Serif SC" w:cs="Noto Serif"/>
+          <w:sz w:val="24"/>
+          <w:szCs w:val="24"/>
+        </w:rPr>
+        <w:t xml:space="preserve"> </w:t>
+      </w:r>
+      <w:proofErr w:type="spellStart"/>
+      <w:r>
+        <w:rPr>
+          <w:rFonts w:ascii="Noto Serif SC" w:eastAsia="Noto Serif SC" w:hAnsi="Noto Serif SC" w:cs="Noto Serif"/>
+          <w:sz w:val="24"/>
+          <w:szCs w:val="24"/>
+          <w:lang w:val="en-US"/>
+        </w:rPr>
+        <w:t>Suona</w:t>
+      </w:r>
+      <w:proofErr w:type="spellEnd"/>
+    </w:p>
+    <w:p>
+      <w:pPr>
+        <w:rPr>
+          <w:rFonts w:ascii="Noto Serif SC" w:eastAsia="Noto Serif SC" w:hAnsi="Noto Serif SC" w:cs="Noto Serif"/>
+          <w:sz w:val="24"/>
+          <w:szCs w:val="24"/>
+          <w:lang w:val="en-US"/>
+        </w:rPr>
+      </w:pPr>
+      <w:r>
+        <w:rPr>
+          <w:rFonts w:ascii="Noto Serif SC" w:eastAsia="Noto Serif SC" w:hAnsi="Noto Serif SC" w:cs="Noto Serif"/>
+          <w:sz w:val="24"/>
+          <w:szCs w:val="24"/>
+          <w:lang w:val="en-US"/>
+        </w:rPr>
+        <w:t>1</w:t>
+      </w:r>
+      <w:r>
+        <w:rPr>
+          <w:rFonts w:ascii="Noto Serif SC" w:eastAsia="Noto Serif SC" w:hAnsi="Noto Serif SC" w:cs="Noto Serif" w:hint="eastAsia"/>
+          <w:sz w:val="24"/>
+          <w:szCs w:val="24"/>
+        </w:rPr>
+        <w:t>低音唢吶</w:t>
+      </w:r>
+      <w:r>
+        <w:rPr>
+          <w:rFonts w:ascii="Noto Serif SC" w:eastAsia="Noto Serif SC" w:hAnsi="Noto Serif SC" w:cs="Noto Serif"/>
+          <w:sz w:val="24"/>
+          <w:szCs w:val="24"/>
+        </w:rPr>
+        <w:t xml:space="preserve"> </w:t>
+      </w:r>
+      <w:r>
+        <w:rPr>
+          <w:rFonts w:ascii="Noto Serif SC" w:eastAsia="Noto Serif SC" w:hAnsi="Noto Serif SC" w:cs="Noto Serif"/>
+          <w:sz w:val="24"/>
+          <w:szCs w:val="24"/>
+          <w:lang w:val="en-US"/>
+        </w:rPr>
+        <w:t xml:space="preserve">1 </w:t>
+      </w:r>
+      <w:r>
+        <w:rPr>
+          <w:rFonts w:ascii="Noto Serif SC" w:eastAsia="Noto Serif SC" w:hAnsi="Noto Serif SC" w:cs="Noto Serif"/>
+          <w:sz w:val="24"/>
+          <w:szCs w:val="24"/>
+        </w:rPr>
+        <w:t xml:space="preserve">Diyin </w:t>
+      </w:r>
+      <w:proofErr w:type="spellStart"/>
+      <w:r>
+        <w:rPr>
+          <w:rFonts w:ascii="Noto Serif SC" w:eastAsia="Noto Serif SC" w:hAnsi="Noto Serif SC" w:cs="Noto Serif"/>
+          <w:sz w:val="24"/>
+          <w:szCs w:val="24"/>
+        </w:rPr>
+        <w:t>Suona</w:t>
+      </w:r>
+      <w:proofErr w:type="spellEnd"/>
+    </w:p>
+    <w:p>
+      <w:pPr>
+        <w:rPr>
+          <w:rFonts w:ascii="Noto Serif SC" w:eastAsia="Noto Serif SC" w:hAnsi="Noto Serif SC" w:cs="Noto Serif"/>
+          <w:sz w:val="24"/>
+          <w:szCs w:val="24"/>
+          <w:lang w:val="en-US"/>
+        </w:rPr>
+      </w:pPr>
+    </w:p>
+    <w:p>
+      <w:pPr>
+        <w:rPr>
+          <w:rFonts w:ascii="Noto Serif SC" w:eastAsia="Noto Serif SC" w:hAnsi="Noto Serif SC" w:cs="Noto Serif"/>
+          <w:sz w:val="24"/>
+          <w:szCs w:val="24"/>
+          <w:lang w:val="en-US"/>
+        </w:rPr>
+      </w:pPr>
+      <w:r>
+        <w:rPr>
+          <w:rFonts w:ascii="Noto Serif SC" w:eastAsia="Noto Serif SC" w:hAnsi="Noto Serif SC" w:cs="Noto Serif"/>
+          <w:sz w:val="24"/>
+          <w:szCs w:val="24"/>
+          <w:lang w:val="en-US"/>
+        </w:rPr>
+        <w:t>2</w:t>
+      </w:r>
+      <w:r>
+        <w:rPr>
+          <w:rFonts w:ascii="Noto Serif SC" w:eastAsia="Noto Serif SC" w:hAnsi="Noto Serif SC" w:cs="Noto Serif" w:hint="eastAsia"/>
+          <w:sz w:val="24"/>
+          <w:szCs w:val="24"/>
+          <w:lang w:val="en-US"/>
+        </w:rPr>
+        <w:t>扬琴</w:t>
+      </w:r>
+      <w:r>
+        <w:rPr>
+          <w:rFonts w:ascii="Noto Serif SC" w:eastAsia="Noto Serif SC" w:hAnsi="Noto Serif SC" w:cs="Noto Serif"/>
+          <w:sz w:val="24"/>
+          <w:szCs w:val="24"/>
+          <w:lang w:val="en-US"/>
+        </w:rPr>
+        <w:t xml:space="preserve"> </w:t>
+      </w:r>
+      <w:r>
+        <w:rPr>
+          <w:rFonts w:ascii="Noto Serif SC" w:eastAsia="Noto Serif SC" w:hAnsi="Noto Serif SC" w:cs="Noto Serif"/>
+          <w:sz w:val="24"/>
+          <w:szCs w:val="24"/>
+          <w:lang w:val="en-US"/>
         </w:rPr>
         <w:t xml:space="preserve">2 </w:t>
       </w:r>
       <w:r>
         <w:rPr>
-          <w:rFonts w:ascii="Noto Serif SC" w:eastAsia="Noto Serif SC" w:hAnsi="Noto Serif SC" w:cs="Noto Serif" w:hint="eastAsia"/>
-          <w:sz w:val="24"/>
-          <w:szCs w:val="24"/>
-          <w:lang w:val="en-GB"/>
-        </w:rPr>
-        <w:t>高音唢</w:t>
-      </w:r>
-      <w:r>
-        <w:rPr>
-          <w:rFonts w:ascii="Noto Serif SC" w:eastAsia="Noto Serif SC" w:hAnsi="Noto Serif SC" w:cs="Noto Serif" w:hint="eastAsia"/>
-          <w:sz w:val="24"/>
-          <w:szCs w:val="24"/>
-          <w:lang w:val="en-US"/>
-        </w:rPr>
-        <w:t>吶</w:t>
-      </w:r>
-      <w:r>
-        <w:rPr>
-          <w:rFonts w:ascii="Noto Serif SC" w:eastAsia="Noto Serif SC" w:hAnsi="Noto Serif SC" w:cs="Noto Serif"/>
-          <w:sz w:val="24"/>
-          <w:szCs w:val="24"/>
-          <w:lang w:val="en-GB"/>
+          <w:rFonts w:ascii="Noto Serif SC" w:eastAsia="Noto Serif SC" w:hAnsi="Noto Serif SC" w:cs="Noto Serif"/>
+          <w:sz w:val="24"/>
+          <w:szCs w:val="24"/>
+          <w:lang w:val="en-US"/>
+        </w:rPr>
+        <w:t>Yangqin</w:t>
+      </w:r>
+    </w:p>
+    <w:p>
+      <w:pPr>
+        <w:rPr>
+          <w:rFonts w:ascii="Noto Serif SC" w:eastAsia="Noto Serif SC" w:hAnsi="Noto Serif SC" w:cs="Noto Serif"/>
+          <w:sz w:val="24"/>
+          <w:szCs w:val="24"/>
+          <w:lang w:val="en-US"/>
+        </w:rPr>
+      </w:pPr>
+      <w:r>
+        <w:rPr>
+          <w:rFonts w:ascii="Noto Serif SC" w:eastAsia="Noto Serif SC" w:hAnsi="Noto Serif SC" w:cs="Noto Serif"/>
+          <w:sz w:val="24"/>
+          <w:szCs w:val="24"/>
+          <w:lang w:val="en-US"/>
+        </w:rPr>
+        <w:t>2</w:t>
+      </w:r>
+      <w:r>
+        <w:rPr>
+          <w:rFonts w:ascii="Noto Serif SC" w:eastAsia="Noto Serif SC" w:hAnsi="Noto Serif SC" w:cs="Noto Serif" w:hint="eastAsia"/>
+          <w:sz w:val="24"/>
+          <w:szCs w:val="24"/>
+          <w:lang w:val="en-US"/>
+        </w:rPr>
+        <w:t>柳琴</w:t>
+      </w:r>
+      <w:r>
+        <w:rPr>
+          <w:rFonts w:ascii="Noto Serif SC" w:eastAsia="Noto Serif SC" w:hAnsi="Noto Serif SC" w:cs="Noto Serif"/>
+          <w:sz w:val="24"/>
+          <w:szCs w:val="24"/>
+          <w:lang w:val="en-US"/>
+        </w:rPr>
+        <w:t xml:space="preserve"> </w:t>
+      </w:r>
+      <w:r>
+        <w:rPr>
+          <w:rFonts w:ascii="Noto Serif SC" w:eastAsia="Noto Serif SC" w:hAnsi="Noto Serif SC" w:cs="Noto Serif"/>
+          <w:sz w:val="24"/>
+          <w:szCs w:val="24"/>
+          <w:lang w:val="en-US"/>
         </w:rPr>
         <w:t xml:space="preserve">2 </w:t>
       </w:r>
@@ -2247,65 +2583,553 @@
           <w:rFonts w:ascii="Noto Serif SC" w:eastAsia="Noto Serif SC" w:hAnsi="Noto Serif SC" w:cs="Noto Serif"/>
           <w:sz w:val="24"/>
           <w:szCs w:val="24"/>
-          <w:lang w:val="en-GB"/>
-        </w:rPr>
-        <w:t>Gaoyin</w:t>
+          <w:lang w:val="en-US"/>
+        </w:rPr>
+        <w:t>Liuqin</w:t>
       </w:r>
       <w:proofErr w:type="spellEnd"/>
-      <w:r>
-        <w:rPr>
-          <w:rFonts w:ascii="Noto Serif SC" w:eastAsia="Noto Serif SC" w:hAnsi="Noto Serif SC" w:cs="Noto Serif"/>
-          <w:sz w:val="24"/>
-          <w:szCs w:val="24"/>
-          <w:lang w:val="en-GB"/>
+    </w:p>
+    <w:p>
+      <w:pPr>
+        <w:rPr>
+          <w:rFonts w:ascii="Noto Serif SC" w:eastAsia="Noto Serif SC" w:hAnsi="Noto Serif SC" w:cs="Noto Serif"/>
+          <w:sz w:val="24"/>
+          <w:szCs w:val="24"/>
+          <w:lang w:val="en-US"/>
+        </w:rPr>
+      </w:pPr>
+      <w:r>
+        <w:rPr>
+          <w:rFonts w:ascii="Noto Serif SC" w:eastAsia="Noto Serif SC" w:hAnsi="Noto Serif SC" w:cs="Noto Serif"/>
+          <w:sz w:val="24"/>
+          <w:szCs w:val="24"/>
+          <w:lang w:val="en-US"/>
+        </w:rPr>
+        <w:t xml:space="preserve">4 </w:t>
+      </w:r>
+      <w:r>
+        <w:rPr>
+          <w:rFonts w:ascii="Noto Serif SC" w:eastAsia="Noto Serif SC" w:hAnsi="Noto Serif SC" w:cs="Noto Serif" w:hint="eastAsia"/>
+          <w:sz w:val="24"/>
+          <w:szCs w:val="24"/>
+          <w:lang w:val="en-US"/>
+        </w:rPr>
+        <w:t>琵琶</w:t>
+      </w:r>
+      <w:r>
+        <w:rPr>
+          <w:rFonts w:ascii="Noto Serif SC" w:eastAsia="Noto Serif SC" w:hAnsi="Noto Serif SC" w:cs="Noto Serif"/>
+          <w:sz w:val="24"/>
+          <w:szCs w:val="24"/>
+          <w:lang w:val="en-US"/>
         </w:rPr>
         <w:t xml:space="preserve"> </w:t>
       </w:r>
+      <w:r>
+        <w:rPr>
+          <w:rFonts w:ascii="Noto Serif SC" w:eastAsia="Noto Serif SC" w:hAnsi="Noto Serif SC" w:cs="Noto Serif"/>
+          <w:sz w:val="24"/>
+          <w:szCs w:val="24"/>
+          <w:lang w:val="en-US"/>
+        </w:rPr>
+        <w:t xml:space="preserve">4 </w:t>
+      </w:r>
+      <w:r>
+        <w:rPr>
+          <w:rFonts w:ascii="Noto Serif SC" w:eastAsia="Noto Serif SC" w:hAnsi="Noto Serif SC" w:cs="Noto Serif"/>
+          <w:sz w:val="24"/>
+          <w:szCs w:val="24"/>
+          <w:lang w:val="en-US"/>
+        </w:rPr>
+        <w:t>Pipa</w:t>
+      </w:r>
+    </w:p>
+    <w:p>
+      <w:pPr>
+        <w:rPr>
+          <w:rFonts w:ascii="Noto Serif SC" w:eastAsia="Noto Serif SC" w:hAnsi="Noto Serif SC" w:cs="Noto Serif"/>
+          <w:sz w:val="24"/>
+          <w:szCs w:val="24"/>
+          <w:lang w:val="en-US"/>
+        </w:rPr>
+      </w:pPr>
+      <w:r>
+        <w:rPr>
+          <w:rFonts w:ascii="Noto Serif SC" w:eastAsia="Noto Serif SC" w:hAnsi="Noto Serif SC" w:cs="Noto Serif"/>
+          <w:sz w:val="24"/>
+          <w:szCs w:val="24"/>
+          <w:lang w:val="en-US"/>
+        </w:rPr>
+        <w:t>4</w:t>
+      </w:r>
+      <w:r>
+        <w:rPr>
+          <w:rFonts w:ascii="Noto Serif SC" w:eastAsia="Noto Serif SC" w:hAnsi="Noto Serif SC" w:cs="Noto Serif" w:hint="eastAsia"/>
+          <w:sz w:val="24"/>
+          <w:szCs w:val="24"/>
+          <w:lang w:val="en-US"/>
+        </w:rPr>
+        <w:t>中阮</w:t>
+      </w:r>
+      <w:r>
+        <w:rPr>
+          <w:rFonts w:ascii="Noto Serif SC" w:eastAsia="Noto Serif SC" w:hAnsi="Noto Serif SC" w:cs="Noto Serif"/>
+          <w:sz w:val="24"/>
+          <w:szCs w:val="24"/>
+          <w:lang w:val="en-US"/>
+        </w:rPr>
+        <w:t xml:space="preserve"> </w:t>
+      </w:r>
+      <w:r>
+        <w:rPr>
+          <w:rFonts w:ascii="Noto Serif SC" w:eastAsia="Noto Serif SC" w:hAnsi="Noto Serif SC" w:cs="Noto Serif"/>
+          <w:sz w:val="24"/>
+          <w:szCs w:val="24"/>
+          <w:lang w:val="en-US"/>
+        </w:rPr>
+        <w:t xml:space="preserve">4 </w:t>
+      </w:r>
+      <w:r>
+        <w:rPr>
+          <w:rFonts w:ascii="Noto Serif SC" w:eastAsia="Noto Serif SC" w:hAnsi="Noto Serif SC" w:cs="Noto Serif"/>
+          <w:sz w:val="24"/>
+          <w:szCs w:val="24"/>
+          <w:lang w:val="en-US"/>
+        </w:rPr>
+        <w:t>Zhongruan</w:t>
+      </w:r>
+    </w:p>
+    <w:p>
+      <w:pPr>
+        <w:rPr>
+          <w:rFonts w:ascii="Noto Serif SC" w:eastAsia="Noto Serif SC" w:hAnsi="Noto Serif SC" w:cs="Noto Serif"/>
+          <w:sz w:val="24"/>
+          <w:szCs w:val="24"/>
+          <w:lang w:val="en-US"/>
+        </w:rPr>
+      </w:pPr>
+      <w:r>
+        <w:rPr>
+          <w:rFonts w:ascii="Noto Serif SC" w:eastAsia="Noto Serif SC" w:hAnsi="Noto Serif SC" w:cs="Noto Serif"/>
+          <w:sz w:val="24"/>
+          <w:szCs w:val="24"/>
+          <w:lang w:val="en-US"/>
+        </w:rPr>
+        <w:t>2</w:t>
+      </w:r>
+      <w:r>
+        <w:rPr>
+          <w:rFonts w:ascii="Noto Serif SC" w:eastAsia="Noto Serif SC" w:hAnsi="Noto Serif SC" w:cs="Noto Serif" w:hint="eastAsia"/>
+          <w:sz w:val="24"/>
+          <w:szCs w:val="24"/>
+          <w:lang w:val="en-US"/>
+        </w:rPr>
+        <w:t>大阮</w:t>
+      </w:r>
+      <w:r>
+        <w:rPr>
+          <w:rFonts w:ascii="Noto Serif SC" w:eastAsia="Noto Serif SC" w:hAnsi="Noto Serif SC" w:cs="Noto Serif"/>
+          <w:sz w:val="24"/>
+          <w:szCs w:val="24"/>
+          <w:lang w:val="en-US"/>
+        </w:rPr>
+        <w:t xml:space="preserve"> </w:t>
+      </w:r>
+      <w:r>
+        <w:rPr>
+          <w:rFonts w:ascii="Noto Serif SC" w:eastAsia="Noto Serif SC" w:hAnsi="Noto Serif SC" w:cs="Noto Serif"/>
+          <w:sz w:val="24"/>
+          <w:szCs w:val="24"/>
+          <w:lang w:val="en-US"/>
+        </w:rPr>
+        <w:t>2 Daruan</w:t>
+      </w:r>
+    </w:p>
+    <w:p>
+      <w:pPr>
+        <w:rPr>
+          <w:rFonts w:ascii="Noto Serif SC" w:eastAsia="Noto Serif SC" w:hAnsi="Noto Serif SC" w:cs="Noto Serif"/>
+          <w:sz w:val="24"/>
+          <w:szCs w:val="24"/>
+          <w:lang w:val="en-US"/>
+        </w:rPr>
+      </w:pPr>
+      <w:r>
+        <w:rPr>
+          <w:rFonts w:ascii="Noto Serif SC" w:eastAsia="Noto Serif SC" w:hAnsi="Noto Serif SC" w:cs="Noto Serif"/>
+          <w:sz w:val="24"/>
+          <w:szCs w:val="24"/>
+          <w:lang w:val="en-US"/>
+        </w:rPr>
+        <w:t>2</w:t>
+      </w:r>
+      <w:r>
+        <w:rPr>
+          <w:rFonts w:ascii="Noto Serif SC" w:eastAsia="Noto Serif SC" w:hAnsi="Noto Serif SC" w:cs="Noto Serif"/>
+          <w:sz w:val="24"/>
+          <w:szCs w:val="24"/>
+          <w:lang w:val="en-US"/>
+        </w:rPr>
+        <w:t xml:space="preserve"> </w:t>
+      </w:r>
+      <w:r>
+        <w:rPr>
+          <w:rFonts w:ascii="Noto Serif SC" w:eastAsia="Noto Serif SC" w:hAnsi="Noto Serif SC" w:cs="Noto Serif" w:hint="eastAsia"/>
+          <w:sz w:val="24"/>
+          <w:szCs w:val="24"/>
+        </w:rPr>
+        <w:t>古筝</w:t>
+      </w:r>
+      <w:r>
+        <w:rPr>
+          <w:rFonts w:ascii="Noto Serif SC" w:eastAsia="Noto Serif SC" w:hAnsi="Noto Serif SC" w:cs="Noto Serif"/>
+          <w:sz w:val="24"/>
+          <w:szCs w:val="24"/>
+          <w:lang w:val="en-US"/>
+        </w:rPr>
+        <w:t xml:space="preserve"> </w:t>
+      </w:r>
+      <w:r>
+        <w:rPr>
+          <w:rFonts w:ascii="Noto Serif SC" w:eastAsia="Noto Serif SC" w:hAnsi="Noto Serif SC" w:cs="Noto Serif"/>
+          <w:sz w:val="24"/>
+          <w:szCs w:val="24"/>
+          <w:lang w:val="en-US"/>
+        </w:rPr>
+        <w:t xml:space="preserve">2 </w:t>
+      </w:r>
+      <w:r>
+        <w:rPr>
+          <w:rFonts w:ascii="Noto Serif SC" w:eastAsia="Noto Serif SC" w:hAnsi="Noto Serif SC" w:cs="Noto Serif"/>
+          <w:sz w:val="24"/>
+          <w:szCs w:val="24"/>
+          <w:lang w:val="en-US"/>
+        </w:rPr>
+        <w:t>Guzheng</w:t>
+      </w:r>
+    </w:p>
+    <w:p>
+      <w:pPr>
+        <w:rPr>
+          <w:rFonts w:ascii="Noto Serif SC" w:eastAsia="Noto Serif SC" w:hAnsi="Noto Serif SC" w:cs="Noto Serif"/>
+          <w:sz w:val="24"/>
+          <w:szCs w:val="24"/>
+          <w:lang w:val="en-US"/>
+        </w:rPr>
+      </w:pPr>
+    </w:p>
+    <w:p>
+      <w:pPr>
+        <w:rPr>
+          <w:rFonts w:ascii="Noto Serif SC" w:eastAsia="Noto Serif SC" w:hAnsi="Noto Serif SC" w:cs="Noto Serif"/>
+          <w:sz w:val="24"/>
+          <w:szCs w:val="24"/>
+          <w:lang w:val="en-US"/>
+        </w:rPr>
+      </w:pPr>
+      <w:r>
+        <w:rPr>
+          <w:rFonts w:ascii="Noto Serif SC" w:eastAsia="Noto Serif SC" w:hAnsi="Noto Serif SC" w:cs="Noto Serif"/>
+          <w:sz w:val="24"/>
+          <w:szCs w:val="24"/>
+          <w:lang w:val="en-US"/>
+        </w:rPr>
+        <w:t>1</w:t>
+      </w:r>
+      <w:r>
+        <w:rPr>
+          <w:rFonts w:ascii="Noto Serif SC" w:eastAsia="Noto Serif SC" w:hAnsi="Noto Serif SC" w:cs="Noto Serif" w:hint="eastAsia"/>
+          <w:sz w:val="24"/>
+          <w:szCs w:val="24"/>
+        </w:rPr>
+        <w:t>定音鼓</w:t>
+      </w:r>
+      <w:r>
+        <w:rPr>
+          <w:rFonts w:ascii="Noto Serif SC" w:eastAsia="Noto Serif SC" w:hAnsi="Noto Serif SC" w:cs="Noto Serif"/>
+          <w:sz w:val="24"/>
+          <w:szCs w:val="24"/>
+          <w:lang w:val="en-US"/>
+        </w:rPr>
+        <w:t xml:space="preserve"> Timpani</w:t>
+      </w:r>
+    </w:p>
+    <w:p>
+      <w:pPr>
+        <w:rPr>
+          <w:rFonts w:ascii="Noto Serif SC" w:eastAsia="Noto Serif SC" w:hAnsi="Noto Serif SC" w:cs="Noto Serif"/>
+          <w:sz w:val="24"/>
+          <w:szCs w:val="24"/>
+          <w:lang w:val="en-US"/>
+        </w:rPr>
+      </w:pPr>
+      <w:r>
+        <w:rPr>
+          <w:rFonts w:ascii="Noto Serif SC" w:eastAsia="Noto Serif SC" w:hAnsi="Noto Serif SC" w:cs="Noto Serif"/>
+          <w:sz w:val="24"/>
+          <w:szCs w:val="24"/>
+        </w:rPr>
+        <w:t>4</w:t>
+      </w:r>
+      <w:r>
+        <w:rPr>
+          <w:rFonts w:ascii="Noto Serif SC" w:eastAsia="Noto Serif SC" w:hAnsi="Noto Serif SC" w:cs="Noto Serif" w:hint="eastAsia"/>
+          <w:sz w:val="24"/>
+          <w:szCs w:val="24"/>
+        </w:rPr>
+        <w:t xml:space="preserve"> 打击乐 </w:t>
+      </w:r>
+      <w:r>
+        <w:rPr>
+          <w:rFonts w:ascii="Noto Serif SC" w:eastAsia="Noto Serif SC" w:hAnsi="Noto Serif SC" w:cs="Noto Serif"/>
+          <w:sz w:val="24"/>
+          <w:szCs w:val="24"/>
+        </w:rPr>
+        <w:t>4</w:t>
+      </w:r>
+      <w:r>
+        <w:rPr>
+          <w:rFonts w:ascii="Noto Serif SC" w:eastAsia="Noto Serif SC" w:hAnsi="Noto Serif SC" w:cs="Noto Serif"/>
+          <w:sz w:val="24"/>
+          <w:szCs w:val="24"/>
+        </w:rPr>
+        <w:t xml:space="preserve"> Percussion</w:t>
+      </w:r>
+    </w:p>
+    <w:p>
+      <w:pPr>
+        <w:ind w:left="720" w:hanging="436"/>
+        <w:rPr>
+          <w:rFonts w:ascii="Noto Serif SC" w:eastAsia="Noto Serif SC" w:hAnsi="Noto Serif SC" w:cs="Noto Serif"/>
+          <w:sz w:val="20"/>
+          <w:szCs w:val="20"/>
+          <w:lang w:val="en-US"/>
+        </w:rPr>
+      </w:pPr>
+      <w:r>
+        <w:rPr>
+          <w:rFonts w:ascii="Noto Serif SC" w:eastAsia="Noto Serif SC" w:hAnsi="Noto Serif SC" w:cs="Noto Serif"/>
+          <w:sz w:val="20"/>
+          <w:szCs w:val="20"/>
+          <w:lang w:val="en-US"/>
+        </w:rPr>
+        <w:t xml:space="preserve">I: </w:t>
+      </w:r>
+      <w:r>
+        <w:rPr>
+          <w:rFonts w:ascii="Noto Serif SC" w:eastAsia="Noto Serif SC" w:hAnsi="Noto Serif SC" w:cs="Noto Serif" w:hint="eastAsia"/>
+          <w:sz w:val="20"/>
+          <w:szCs w:val="20"/>
+        </w:rPr>
+        <w:t>大军鼓</w:t>
+      </w:r>
+      <w:r>
+        <w:rPr>
+          <w:rFonts w:ascii="Noto Serif SC" w:eastAsia="Noto Serif SC" w:hAnsi="Noto Serif SC" w:cs="Noto Serif"/>
+          <w:sz w:val="20"/>
+          <w:szCs w:val="20"/>
+        </w:rPr>
+        <w:t xml:space="preserve"> Bass Drum, </w:t>
+      </w:r>
+      <w:r>
+        <w:rPr>
+          <w:rFonts w:ascii="Noto Serif SC" w:eastAsia="Noto Serif SC" w:hAnsi="Noto Serif SC" w:cs="Noto Serif" w:hint="eastAsia"/>
+          <w:sz w:val="20"/>
+          <w:szCs w:val="20"/>
+        </w:rPr>
+        <w:t>板鼓</w:t>
+      </w:r>
+      <w:r>
+        <w:rPr>
+          <w:rFonts w:ascii="Noto Serif SC" w:eastAsia="Noto Serif SC" w:hAnsi="Noto Serif SC" w:cs="Noto Serif"/>
+          <w:sz w:val="20"/>
+          <w:szCs w:val="20"/>
+        </w:rPr>
+        <w:t xml:space="preserve"> Bangu</w:t>
+      </w:r>
+    </w:p>
+    <w:p>
+      <w:pPr>
+        <w:ind w:left="720" w:hanging="436"/>
+        <w:rPr>
+          <w:rFonts w:ascii="Noto Serif SC" w:eastAsia="Noto Serif SC" w:hAnsi="Noto Serif SC" w:cs="Noto Serif"/>
+          <w:sz w:val="20"/>
+          <w:szCs w:val="20"/>
+        </w:rPr>
+      </w:pPr>
+      <w:r>
+        <w:rPr>
+          <w:rFonts w:ascii="Noto Serif SC" w:eastAsia="Noto Serif SC" w:hAnsi="Noto Serif SC" w:cs="Noto Serif"/>
+          <w:sz w:val="20"/>
+          <w:szCs w:val="20"/>
+          <w:lang w:val="en-US"/>
+        </w:rPr>
+        <w:t xml:space="preserve">II: </w:t>
+      </w:r>
+      <w:r>
+        <w:rPr>
+          <w:rFonts w:ascii="Noto Serif SC" w:eastAsia="Noto Serif SC" w:hAnsi="Noto Serif SC" w:cs="Noto Serif" w:hint="eastAsia"/>
+          <w:sz w:val="20"/>
+          <w:szCs w:val="20"/>
+        </w:rPr>
+        <w:t>吊镲</w:t>
+      </w:r>
+      <w:r>
+        <w:rPr>
+          <w:rFonts w:ascii="Noto Serif SC" w:eastAsia="Noto Serif SC" w:hAnsi="Noto Serif SC" w:cs="Noto Serif"/>
+          <w:sz w:val="20"/>
+          <w:szCs w:val="20"/>
+        </w:rPr>
+        <w:t xml:space="preserve"> Suspended Cymbal, </w:t>
+      </w:r>
+      <w:r>
+        <w:rPr>
+          <w:rFonts w:ascii="Noto Serif SC" w:eastAsia="Noto Serif SC" w:hAnsi="Noto Serif SC" w:cs="Noto Serif" w:hint="eastAsia"/>
+          <w:sz w:val="20"/>
+          <w:szCs w:val="20"/>
+        </w:rPr>
+        <w:t>碰铃</w:t>
+      </w:r>
+      <w:r>
+        <w:rPr>
+          <w:rFonts w:ascii="Noto Serif SC" w:eastAsia="Noto Serif SC" w:hAnsi="Noto Serif SC" w:cs="Noto Serif"/>
+          <w:sz w:val="20"/>
+          <w:szCs w:val="20"/>
+        </w:rPr>
+        <w:t xml:space="preserve"> </w:t>
+      </w:r>
       <w:proofErr w:type="spellStart"/>
       <w:r>
         <w:rPr>
           <w:rFonts w:ascii="Noto Serif SC" w:eastAsia="Noto Serif SC" w:hAnsi="Noto Serif SC" w:cs="Noto Serif"/>
-          <w:sz w:val="24"/>
-          <w:szCs w:val="24"/>
-          <w:lang w:val="en-GB"/>
-        </w:rPr>
-        <w:t>Suona</w:t>
+          <w:sz w:val="20"/>
+          <w:szCs w:val="20"/>
+        </w:rPr>
+        <w:t>Pengling</w:t>
       </w:r>
       <w:proofErr w:type="spellEnd"/>
-    </w:p>
-    <w:p>
-      <w:pPr>
-        <w:rPr>
-          <w:rFonts w:ascii="Noto Serif SC" w:eastAsia="Noto Serif SC" w:hAnsi="Noto Serif SC" w:cs="Noto Serif"/>
-          <w:sz w:val="24"/>
-          <w:szCs w:val="24"/>
-          <w:lang w:val="en-US"/>
-        </w:rPr>
-      </w:pPr>
-      <w:r>
-        <w:rPr>
-          <w:rFonts w:ascii="Noto Serif SC" w:eastAsia="Noto Serif SC" w:hAnsi="Noto Serif SC" w:cs="Noto Serif"/>
-          <w:sz w:val="24"/>
-          <w:szCs w:val="24"/>
-          <w:lang w:val="en-US"/>
-        </w:rPr>
-        <w:t>1</w:t>
-      </w:r>
-      <w:r>
-        <w:rPr>
-          <w:rFonts w:ascii="Noto Serif SC" w:eastAsia="Noto Serif SC" w:hAnsi="Noto Serif SC" w:cs="Noto Serif" w:hint="eastAsia"/>
-          <w:sz w:val="24"/>
-          <w:szCs w:val="24"/>
-          <w:lang w:val="en-US"/>
-        </w:rPr>
-        <w:t>中音唢吶</w:t>
-      </w:r>
-      <w:r>
-        <w:rPr>
-          <w:rFonts w:ascii="Noto Serif SC" w:eastAsia="Noto Serif SC" w:hAnsi="Noto Serif SC" w:cs="Noto Serif"/>
-          <w:sz w:val="24"/>
-          <w:szCs w:val="24"/>
-          <w:lang w:val="en-US"/>
+      <w:r>
+        <w:rPr>
+          <w:rFonts w:ascii="Noto Serif SC" w:eastAsia="Noto Serif SC" w:hAnsi="Noto Serif SC" w:cs="Noto Serif"/>
+          <w:sz w:val="20"/>
+          <w:szCs w:val="20"/>
+        </w:rPr>
+        <w:t xml:space="preserve">, </w:t>
+      </w:r>
+      <w:r>
+        <w:rPr>
+          <w:rFonts w:ascii="Noto Serif SC" w:eastAsia="Noto Serif SC" w:hAnsi="Noto Serif SC" w:cs="Noto Serif" w:hint="eastAsia"/>
+          <w:sz w:val="20"/>
+          <w:szCs w:val="20"/>
+        </w:rPr>
+        <w:t>低音木鱼</w:t>
+      </w:r>
+      <w:r>
+        <w:rPr>
+          <w:rFonts w:ascii="Noto Serif SC" w:eastAsia="Noto Serif SC" w:hAnsi="Noto Serif SC" w:cs="Noto Serif"/>
+          <w:sz w:val="20"/>
+          <w:szCs w:val="20"/>
+        </w:rPr>
+        <w:t xml:space="preserve"> Low Woodblock</w:t>
+      </w:r>
+    </w:p>
+    <w:p>
+      <w:pPr>
+        <w:ind w:left="720" w:hanging="436"/>
+        <w:rPr>
+          <w:rFonts w:ascii="Noto Serif SC" w:eastAsia="Noto Serif SC" w:hAnsi="Noto Serif SC" w:cs="Noto Serif"/>
+          <w:sz w:val="20"/>
+          <w:szCs w:val="20"/>
+        </w:rPr>
+      </w:pPr>
+      <w:r>
+        <w:rPr>
+          <w:rFonts w:ascii="Noto Serif SC" w:eastAsia="Noto Serif SC" w:hAnsi="Noto Serif SC" w:cs="Noto Serif"/>
+          <w:sz w:val="20"/>
+          <w:szCs w:val="20"/>
+          <w:lang w:val="en-US"/>
+        </w:rPr>
+        <w:t xml:space="preserve">III: </w:t>
+      </w:r>
+      <w:r>
+        <w:rPr>
+          <w:rFonts w:ascii="Noto Serif SC" w:eastAsia="Noto Serif SC" w:hAnsi="Noto Serif SC" w:cs="Noto Serif" w:hint="eastAsia"/>
+          <w:sz w:val="20"/>
+          <w:szCs w:val="20"/>
+          <w:lang w:val="en-US"/>
+        </w:rPr>
+        <w:t>小军鼓</w:t>
+      </w:r>
+      <w:r>
+        <w:rPr>
+          <w:rFonts w:ascii="Noto Serif SC" w:eastAsia="Noto Serif SC" w:hAnsi="Noto Serif SC" w:cs="Noto Serif"/>
+          <w:sz w:val="20"/>
+          <w:szCs w:val="20"/>
+          <w:lang w:val="en-US"/>
+        </w:rPr>
+        <w:t xml:space="preserve"> Snare Drum, </w:t>
+      </w:r>
+      <w:r>
+        <w:rPr>
+          <w:rFonts w:ascii="Noto Serif SC" w:eastAsia="Noto Serif SC" w:hAnsi="Noto Serif SC" w:cs="Noto Serif" w:hint="eastAsia"/>
+          <w:sz w:val="20"/>
+          <w:szCs w:val="20"/>
+        </w:rPr>
+        <w:t>铃鼓</w:t>
+      </w:r>
+      <w:r>
+        <w:rPr>
+          <w:rFonts w:ascii="Noto Serif SC" w:eastAsia="Noto Serif SC" w:hAnsi="Noto Serif SC" w:cs="Noto Serif"/>
+          <w:sz w:val="20"/>
+          <w:szCs w:val="20"/>
+        </w:rPr>
+        <w:t xml:space="preserve"> Tambourine, </w:t>
+      </w:r>
+      <w:r>
+        <w:rPr>
+          <w:rFonts w:ascii="Noto Serif SC" w:eastAsia="Noto Serif SC" w:hAnsi="Noto Serif SC" w:cs="Noto Serif" w:hint="eastAsia"/>
+          <w:sz w:val="20"/>
+          <w:szCs w:val="20"/>
+        </w:rPr>
+        <w:t>钟琴</w:t>
+      </w:r>
+      <w:r>
+        <w:rPr>
+          <w:rFonts w:ascii="Noto Serif SC" w:eastAsia="Noto Serif SC" w:hAnsi="Noto Serif SC" w:cs="Noto Serif"/>
+          <w:sz w:val="20"/>
+          <w:szCs w:val="20"/>
+        </w:rPr>
+        <w:t xml:space="preserve"> Glockenspiel, </w:t>
+      </w:r>
+      <w:r>
+        <w:rPr>
+          <w:rFonts w:ascii="Noto Serif SC" w:eastAsia="Noto Serif SC" w:hAnsi="Noto Serif SC" w:cs="Noto Serif" w:hint="eastAsia"/>
+          <w:sz w:val="20"/>
+          <w:szCs w:val="20"/>
+        </w:rPr>
+        <w:t>小钹</w:t>
+      </w:r>
+      <w:r>
+        <w:rPr>
+          <w:rFonts w:ascii="Noto Serif SC" w:eastAsia="Noto Serif SC" w:hAnsi="Noto Serif SC" w:cs="Noto Serif"/>
+          <w:sz w:val="20"/>
+          <w:szCs w:val="20"/>
+        </w:rPr>
+        <w:t xml:space="preserve"> Xiaobo, </w:t>
+      </w:r>
+      <w:r>
+        <w:rPr>
+          <w:rFonts w:ascii="Noto Serif SC" w:eastAsia="Noto Serif SC" w:hAnsi="Noto Serif SC" w:cs="Noto Serif" w:hint="eastAsia"/>
+          <w:sz w:val="20"/>
+          <w:szCs w:val="20"/>
+        </w:rPr>
+        <w:t>小堂鼓</w:t>
+      </w:r>
+      <w:r>
+        <w:rPr>
+          <w:rFonts w:ascii="Noto Serif SC" w:eastAsia="Noto Serif SC" w:hAnsi="Noto Serif SC" w:cs="Noto Serif"/>
+          <w:sz w:val="20"/>
+          <w:szCs w:val="20"/>
         </w:rPr>
         <w:t xml:space="preserve"> </w:t>
       </w:r>
@@ -2313,19 +3137,61 @@
       <w:r>
         <w:rPr>
           <w:rFonts w:ascii="Noto Serif SC" w:eastAsia="Noto Serif SC" w:hAnsi="Noto Serif SC" w:cs="Noto Serif"/>
-          <w:sz w:val="24"/>
-          <w:szCs w:val="24"/>
-          <w:lang w:val="en-US"/>
-        </w:rPr>
-        <w:t>Zhongyin</w:t>
+          <w:sz w:val="20"/>
+          <w:szCs w:val="20"/>
+        </w:rPr>
+        <w:t>Xiaotanggu</w:t>
       </w:r>
       <w:proofErr w:type="spellEnd"/>
-      <w:r>
-        <w:rPr>
-          <w:rFonts w:ascii="Noto Serif SC" w:eastAsia="Noto Serif SC" w:hAnsi="Noto Serif SC" w:cs="Noto Serif"/>
-          <w:sz w:val="24"/>
-          <w:szCs w:val="24"/>
-          <w:lang w:val="en-US"/>
+    </w:p>
+    <w:p>
+      <w:pPr>
+        <w:ind w:left="720" w:hanging="436"/>
+        <w:rPr>
+          <w:rFonts w:ascii="Noto Serif SC" w:eastAsia="Noto Serif SC" w:hAnsi="Noto Serif SC" w:cs="Noto Serif"/>
+          <w:sz w:val="20"/>
+          <w:szCs w:val="20"/>
+          <w:lang w:val="en-US"/>
+        </w:rPr>
+      </w:pPr>
+      <w:r>
+        <w:rPr>
+          <w:rFonts w:ascii="Noto Serif SC" w:eastAsia="Noto Serif SC" w:hAnsi="Noto Serif SC" w:cs="Noto Serif"/>
+          <w:sz w:val="20"/>
+          <w:szCs w:val="20"/>
+          <w:lang w:val="en-US"/>
+        </w:rPr>
+        <w:t xml:space="preserve">IV: </w:t>
+      </w:r>
+      <w:r>
+        <w:rPr>
+          <w:rFonts w:ascii="Noto Serif SC" w:eastAsia="Noto Serif SC" w:hAnsi="Noto Serif SC" w:cs="Noto Serif" w:hint="eastAsia"/>
+          <w:sz w:val="20"/>
+          <w:szCs w:val="20"/>
+        </w:rPr>
+        <w:t>鞭子</w:t>
+      </w:r>
+      <w:r>
+        <w:rPr>
+          <w:rFonts w:ascii="Noto Serif SC" w:eastAsia="Noto Serif SC" w:hAnsi="Noto Serif SC" w:cs="Noto Serif"/>
+          <w:sz w:val="20"/>
+          <w:szCs w:val="20"/>
+        </w:rPr>
+        <w:t xml:space="preserve"> Whip, </w:t>
+      </w:r>
+      <w:r>
+        <w:rPr>
+          <w:rFonts w:ascii="Noto Serif SC" w:eastAsia="Noto Serif SC" w:hAnsi="Noto Serif SC" w:cs="Noto Serif" w:hint="eastAsia"/>
+          <w:sz w:val="20"/>
+          <w:szCs w:val="20"/>
+        </w:rPr>
+        <w:t>中钹</w:t>
+      </w:r>
+      <w:r>
+        <w:rPr>
+          <w:rFonts w:ascii="Noto Serif SC" w:eastAsia="Noto Serif SC" w:hAnsi="Noto Serif SC" w:cs="Noto Serif"/>
+          <w:sz w:val="20"/>
+          <w:szCs w:val="20"/>
         </w:rPr>
         <w:t xml:space="preserve"> </w:t>
       </w:r>
@@ -2333,74 +3199,68 @@
       <w:r>
         <w:rPr>
           <w:rFonts w:ascii="Noto Serif SC" w:eastAsia="Noto Serif SC" w:hAnsi="Noto Serif SC" w:cs="Noto Serif"/>
-          <w:sz w:val="24"/>
-          <w:szCs w:val="24"/>
-          <w:lang w:val="en-US"/>
-        </w:rPr>
-        <w:t>Suona</w:t>
+          <w:sz w:val="20"/>
+          <w:szCs w:val="20"/>
+        </w:rPr>
+        <w:t>Zhongbo</w:t>
       </w:r>
       <w:proofErr w:type="spellEnd"/>
-    </w:p>
-    <w:p>
-      <w:pPr>
-        <w:rPr>
-          <w:rFonts w:ascii="Noto Serif SC" w:eastAsia="Noto Serif SC" w:hAnsi="Noto Serif SC" w:cs="Noto Serif"/>
-          <w:sz w:val="24"/>
-          <w:szCs w:val="24"/>
-          <w:lang w:val="en-US"/>
-        </w:rPr>
-      </w:pPr>
-      <w:r>
-        <w:rPr>
-          <w:rFonts w:ascii="Noto Serif SC" w:eastAsia="Noto Serif SC" w:hAnsi="Noto Serif SC" w:cs="Noto Serif"/>
-          <w:sz w:val="24"/>
-          <w:szCs w:val="24"/>
-          <w:lang w:val="en-US"/>
-        </w:rPr>
-        <w:t>1</w:t>
-      </w:r>
-      <w:r>
-        <w:rPr>
-          <w:rFonts w:ascii="Noto Serif SC" w:eastAsia="Noto Serif SC" w:hAnsi="Noto Serif SC" w:cs="Noto Serif" w:hint="eastAsia"/>
-          <w:sz w:val="24"/>
-          <w:szCs w:val="24"/>
-          <w:lang w:val="en-US"/>
-        </w:rPr>
-        <w:t>次中唢吶</w:t>
-      </w:r>
-      <w:r>
-        <w:rPr>
-          <w:rFonts w:ascii="Noto Serif SC" w:eastAsia="Noto Serif SC" w:hAnsi="Noto Serif SC" w:cs="Noto Serif"/>
-          <w:sz w:val="24"/>
-          <w:szCs w:val="24"/>
-          <w:lang w:val="en-US"/>
+      <w:r>
+        <w:rPr>
+          <w:rFonts w:ascii="Noto Serif SC" w:eastAsia="Noto Serif SC" w:hAnsi="Noto Serif SC" w:cs="Noto Serif"/>
+          <w:sz w:val="20"/>
+          <w:szCs w:val="20"/>
+        </w:rPr>
+        <w:t xml:space="preserve">, </w:t>
+      </w:r>
+      <w:r>
+        <w:rPr>
+          <w:rFonts w:ascii="Noto Serif SC" w:eastAsia="Noto Serif SC" w:hAnsi="Noto Serif SC" w:cs="Noto Serif" w:hint="eastAsia"/>
+          <w:sz w:val="20"/>
+          <w:szCs w:val="20"/>
+        </w:rPr>
+        <w:t>中国小钹</w:t>
+      </w:r>
+      <w:r>
+        <w:rPr>
+          <w:rFonts w:ascii="Noto Serif SC" w:eastAsia="Noto Serif SC" w:hAnsi="Noto Serif SC" w:cs="Noto Serif"/>
+          <w:sz w:val="20"/>
+          <w:szCs w:val="20"/>
+          <w:lang w:val="en-GB"/>
         </w:rPr>
         <w:t xml:space="preserve"> </w:t>
       </w:r>
-      <w:r>
-        <w:rPr>
-          <w:rFonts w:ascii="Noto Serif SC" w:eastAsia="Noto Serif SC" w:hAnsi="Noto Serif SC" w:cs="Noto Serif"/>
-          <w:sz w:val="24"/>
-          <w:szCs w:val="24"/>
-          <w:lang w:val="en-US"/>
-        </w:rPr>
-        <w:t xml:space="preserve">1 </w:t>
-      </w:r>
       <w:proofErr w:type="spellStart"/>
       <w:r>
         <w:rPr>
           <w:rFonts w:ascii="Noto Serif SC" w:eastAsia="Noto Serif SC" w:hAnsi="Noto Serif SC" w:cs="Noto Serif"/>
-          <w:sz w:val="24"/>
-          <w:szCs w:val="24"/>
-        </w:rPr>
-        <w:t>Cizhongyin</w:t>
+          <w:sz w:val="20"/>
+          <w:szCs w:val="20"/>
+        </w:rPr>
+        <w:t>Xiaoluo</w:t>
       </w:r>
       <w:proofErr w:type="spellEnd"/>
       <w:r>
         <w:rPr>
           <w:rFonts w:ascii="Noto Serif SC" w:eastAsia="Noto Serif SC" w:hAnsi="Noto Serif SC" w:cs="Noto Serif"/>
-          <w:sz w:val="24"/>
-          <w:szCs w:val="24"/>
+          <w:sz w:val="20"/>
+          <w:szCs w:val="20"/>
+        </w:rPr>
+        <w:t xml:space="preserve">, </w:t>
+      </w:r>
+      <w:r>
+        <w:rPr>
+          <w:rFonts w:ascii="Noto Serif SC" w:eastAsia="Noto Serif SC" w:hAnsi="Noto Serif SC" w:cs="Noto Serif" w:hint="eastAsia"/>
+          <w:sz w:val="20"/>
+          <w:szCs w:val="20"/>
+        </w:rPr>
+        <w:t>中国大钹</w:t>
+      </w:r>
+      <w:r>
+        <w:rPr>
+          <w:rFonts w:ascii="Noto Serif SC" w:eastAsia="Noto Serif SC" w:hAnsi="Noto Serif SC" w:cs="Noto Serif"/>
+          <w:sz w:val="20"/>
+          <w:szCs w:val="20"/>
         </w:rPr>
         <w:t xml:space="preserve"> </w:t>
       </w:r>
@@ -2408,625 +3268,12 @@
       <w:r>
         <w:rPr>
           <w:rFonts w:ascii="Noto Serif SC" w:eastAsia="Noto Serif SC" w:hAnsi="Noto Serif SC" w:cs="Noto Serif"/>
-          <w:sz w:val="24"/>
-          <w:szCs w:val="24"/>
-          <w:lang w:val="en-US"/>
-        </w:rPr>
-        <w:t>Suona</w:t>
+          <w:sz w:val="20"/>
+          <w:szCs w:val="20"/>
+        </w:rPr>
+        <w:t>Daluo</w:t>
       </w:r>
       <w:proofErr w:type="spellEnd"/>
-    </w:p>
-    <w:p>
-      <w:pPr>
-        <w:rPr>
-          <w:rFonts w:ascii="Noto Serif SC" w:eastAsia="Noto Serif SC" w:hAnsi="Noto Serif SC" w:cs="Noto Serif"/>
-          <w:sz w:val="24"/>
-          <w:szCs w:val="24"/>
-          <w:lang w:val="en-US"/>
-        </w:rPr>
-      </w:pPr>
-      <w:r>
-        <w:rPr>
-          <w:rFonts w:ascii="Noto Serif SC" w:eastAsia="Noto Serif SC" w:hAnsi="Noto Serif SC" w:cs="Noto Serif"/>
-          <w:sz w:val="24"/>
-          <w:szCs w:val="24"/>
-          <w:lang w:val="en-US"/>
-        </w:rPr>
-        <w:t>1</w:t>
-      </w:r>
-      <w:r>
-        <w:rPr>
-          <w:rFonts w:ascii="Noto Serif SC" w:eastAsia="Noto Serif SC" w:hAnsi="Noto Serif SC" w:cs="Noto Serif" w:hint="eastAsia"/>
-          <w:sz w:val="24"/>
-          <w:szCs w:val="24"/>
-        </w:rPr>
-        <w:t>低音唢吶</w:t>
-      </w:r>
-      <w:r>
-        <w:rPr>
-          <w:rFonts w:ascii="Noto Serif SC" w:eastAsia="Noto Serif SC" w:hAnsi="Noto Serif SC" w:cs="Noto Serif"/>
-          <w:sz w:val="24"/>
-          <w:szCs w:val="24"/>
-        </w:rPr>
-        <w:t xml:space="preserve"> </w:t>
-      </w:r>
-      <w:r>
-        <w:rPr>
-          <w:rFonts w:ascii="Noto Serif SC" w:eastAsia="Noto Serif SC" w:hAnsi="Noto Serif SC" w:cs="Noto Serif"/>
-          <w:sz w:val="24"/>
-          <w:szCs w:val="24"/>
-          <w:lang w:val="en-US"/>
-        </w:rPr>
-        <w:t xml:space="preserve">1 </w:t>
-      </w:r>
-      <w:proofErr w:type="spellStart"/>
-      <w:r>
-        <w:rPr>
-          <w:rFonts w:ascii="Noto Serif SC" w:eastAsia="Noto Serif SC" w:hAnsi="Noto Serif SC" w:cs="Noto Serif"/>
-          <w:sz w:val="24"/>
-          <w:szCs w:val="24"/>
-        </w:rPr>
-        <w:t>Diyin</w:t>
-      </w:r>
-      <w:proofErr w:type="spellEnd"/>
-      <w:r>
-        <w:rPr>
-          <w:rFonts w:ascii="Noto Serif SC" w:eastAsia="Noto Serif SC" w:hAnsi="Noto Serif SC" w:cs="Noto Serif"/>
-          <w:sz w:val="24"/>
-          <w:szCs w:val="24"/>
-        </w:rPr>
-        <w:t xml:space="preserve"> </w:t>
-      </w:r>
-      <w:proofErr w:type="spellStart"/>
-      <w:r>
-        <w:rPr>
-          <w:rFonts w:ascii="Noto Serif SC" w:eastAsia="Noto Serif SC" w:hAnsi="Noto Serif SC" w:cs="Noto Serif"/>
-          <w:sz w:val="24"/>
-          <w:szCs w:val="24"/>
-        </w:rPr>
-        <w:t>Suona</w:t>
-      </w:r>
-      <w:proofErr w:type="spellEnd"/>
-    </w:p>
-    <w:p>
-      <w:pPr>
-        <w:rPr>
-          <w:rFonts w:ascii="Noto Serif SC" w:eastAsia="Noto Serif SC" w:hAnsi="Noto Serif SC" w:cs="Noto Serif"/>
-          <w:sz w:val="24"/>
-          <w:szCs w:val="24"/>
-          <w:lang w:val="en-US"/>
-        </w:rPr>
-      </w:pPr>
-    </w:p>
-    <w:p>
-      <w:pPr>
-        <w:rPr>
-          <w:rFonts w:ascii="Noto Serif SC" w:eastAsia="Noto Serif SC" w:hAnsi="Noto Serif SC" w:cs="Noto Serif"/>
-          <w:sz w:val="24"/>
-          <w:szCs w:val="24"/>
-          <w:lang w:val="en-US"/>
-        </w:rPr>
-      </w:pPr>
-      <w:r>
-        <w:rPr>
-          <w:rFonts w:ascii="Noto Serif SC" w:eastAsia="Noto Serif SC" w:hAnsi="Noto Serif SC" w:cs="Noto Serif"/>
-          <w:sz w:val="24"/>
-          <w:szCs w:val="24"/>
-          <w:lang w:val="en-US"/>
-        </w:rPr>
-        <w:t>2</w:t>
-      </w:r>
-      <w:r>
-        <w:rPr>
-          <w:rFonts w:ascii="Noto Serif SC" w:eastAsia="Noto Serif SC" w:hAnsi="Noto Serif SC" w:cs="Noto Serif" w:hint="eastAsia"/>
-          <w:sz w:val="24"/>
-          <w:szCs w:val="24"/>
-          <w:lang w:val="en-US"/>
-        </w:rPr>
-        <w:t>扬琴</w:t>
-      </w:r>
-      <w:r>
-        <w:rPr>
-          <w:rFonts w:ascii="Noto Serif SC" w:eastAsia="Noto Serif SC" w:hAnsi="Noto Serif SC" w:cs="Noto Serif"/>
-          <w:sz w:val="24"/>
-          <w:szCs w:val="24"/>
-          <w:lang w:val="en-US"/>
-        </w:rPr>
-        <w:t xml:space="preserve"> </w:t>
-      </w:r>
-      <w:r>
-        <w:rPr>
-          <w:rFonts w:ascii="Noto Serif SC" w:eastAsia="Noto Serif SC" w:hAnsi="Noto Serif SC" w:cs="Noto Serif"/>
-          <w:sz w:val="24"/>
-          <w:szCs w:val="24"/>
-          <w:lang w:val="en-US"/>
-        </w:rPr>
-        <w:t xml:space="preserve">2 </w:t>
-      </w:r>
-      <w:r>
-        <w:rPr>
-          <w:rFonts w:ascii="Noto Serif SC" w:eastAsia="Noto Serif SC" w:hAnsi="Noto Serif SC" w:cs="Noto Serif"/>
-          <w:sz w:val="24"/>
-          <w:szCs w:val="24"/>
-          <w:lang w:val="en-US"/>
-        </w:rPr>
-        <w:t>Yangqin</w:t>
-      </w:r>
-    </w:p>
-    <w:p>
-      <w:pPr>
-        <w:rPr>
-          <w:rFonts w:ascii="Noto Serif SC" w:eastAsia="Noto Serif SC" w:hAnsi="Noto Serif SC" w:cs="Noto Serif"/>
-          <w:sz w:val="24"/>
-          <w:szCs w:val="24"/>
-          <w:lang w:val="en-US"/>
-        </w:rPr>
-      </w:pPr>
-      <w:r>
-        <w:rPr>
-          <w:rFonts w:ascii="Noto Serif SC" w:eastAsia="Noto Serif SC" w:hAnsi="Noto Serif SC" w:cs="Noto Serif"/>
-          <w:sz w:val="24"/>
-          <w:szCs w:val="24"/>
-          <w:lang w:val="en-US"/>
-        </w:rPr>
-        <w:t>2</w:t>
-      </w:r>
-      <w:r>
-        <w:rPr>
-          <w:rFonts w:ascii="Noto Serif SC" w:eastAsia="Noto Serif SC" w:hAnsi="Noto Serif SC" w:cs="Noto Serif" w:hint="eastAsia"/>
-          <w:sz w:val="24"/>
-          <w:szCs w:val="24"/>
-          <w:lang w:val="en-US"/>
-        </w:rPr>
-        <w:t>柳琴</w:t>
-      </w:r>
-      <w:r>
-        <w:rPr>
-          <w:rFonts w:ascii="Noto Serif SC" w:eastAsia="Noto Serif SC" w:hAnsi="Noto Serif SC" w:cs="Noto Serif"/>
-          <w:sz w:val="24"/>
-          <w:szCs w:val="24"/>
-          <w:lang w:val="en-US"/>
-        </w:rPr>
-        <w:t xml:space="preserve"> </w:t>
-      </w:r>
-      <w:r>
-        <w:rPr>
-          <w:rFonts w:ascii="Noto Serif SC" w:eastAsia="Noto Serif SC" w:hAnsi="Noto Serif SC" w:cs="Noto Serif"/>
-          <w:sz w:val="24"/>
-          <w:szCs w:val="24"/>
-          <w:lang w:val="en-US"/>
-        </w:rPr>
-        <w:t xml:space="preserve">2 </w:t>
-      </w:r>
-      <w:proofErr w:type="spellStart"/>
-      <w:r>
-        <w:rPr>
-          <w:rFonts w:ascii="Noto Serif SC" w:eastAsia="Noto Serif SC" w:hAnsi="Noto Serif SC" w:cs="Noto Serif"/>
-          <w:sz w:val="24"/>
-          <w:szCs w:val="24"/>
-          <w:lang w:val="en-US"/>
-        </w:rPr>
-        <w:t>Liuqin</w:t>
-      </w:r>
-      <w:proofErr w:type="spellEnd"/>
-    </w:p>
-    <w:p>
-      <w:pPr>
-        <w:rPr>
-          <w:rFonts w:ascii="Noto Serif SC" w:eastAsia="Noto Serif SC" w:hAnsi="Noto Serif SC" w:cs="Noto Serif"/>
-          <w:sz w:val="24"/>
-          <w:szCs w:val="24"/>
-          <w:lang w:val="en-US"/>
-        </w:rPr>
-      </w:pPr>
-      <w:r>
-        <w:rPr>
-          <w:rFonts w:ascii="Noto Serif SC" w:eastAsia="Noto Serif SC" w:hAnsi="Noto Serif SC" w:cs="Noto Serif"/>
-          <w:sz w:val="24"/>
-          <w:szCs w:val="24"/>
-          <w:lang w:val="en-US"/>
-        </w:rPr>
-        <w:t xml:space="preserve">4 </w:t>
-      </w:r>
-      <w:r>
-        <w:rPr>
-          <w:rFonts w:ascii="Noto Serif SC" w:eastAsia="Noto Serif SC" w:hAnsi="Noto Serif SC" w:cs="Noto Serif" w:hint="eastAsia"/>
-          <w:sz w:val="24"/>
-          <w:szCs w:val="24"/>
-          <w:lang w:val="en-US"/>
-        </w:rPr>
-        <w:t>琵琶</w:t>
-      </w:r>
-      <w:r>
-        <w:rPr>
-          <w:rFonts w:ascii="Noto Serif SC" w:eastAsia="Noto Serif SC" w:hAnsi="Noto Serif SC" w:cs="Noto Serif"/>
-          <w:sz w:val="24"/>
-          <w:szCs w:val="24"/>
-          <w:lang w:val="en-US"/>
-        </w:rPr>
-        <w:t xml:space="preserve"> </w:t>
-      </w:r>
-      <w:r>
-        <w:rPr>
-          <w:rFonts w:ascii="Noto Serif SC" w:eastAsia="Noto Serif SC" w:hAnsi="Noto Serif SC" w:cs="Noto Serif"/>
-          <w:sz w:val="24"/>
-          <w:szCs w:val="24"/>
-          <w:lang w:val="en-US"/>
-        </w:rPr>
-        <w:t xml:space="preserve">4 </w:t>
-      </w:r>
-      <w:r>
-        <w:rPr>
-          <w:rFonts w:ascii="Noto Serif SC" w:eastAsia="Noto Serif SC" w:hAnsi="Noto Serif SC" w:cs="Noto Serif"/>
-          <w:sz w:val="24"/>
-          <w:szCs w:val="24"/>
-          <w:lang w:val="en-US"/>
-        </w:rPr>
-        <w:t>Pipa</w:t>
-      </w:r>
-    </w:p>
-    <w:p>
-      <w:pPr>
-        <w:rPr>
-          <w:rFonts w:ascii="Noto Serif SC" w:eastAsia="Noto Serif SC" w:hAnsi="Noto Serif SC" w:cs="Noto Serif"/>
-          <w:sz w:val="24"/>
-          <w:szCs w:val="24"/>
-          <w:lang w:val="en-US"/>
-        </w:rPr>
-      </w:pPr>
-      <w:r>
-        <w:rPr>
-          <w:rFonts w:ascii="Noto Serif SC" w:eastAsia="Noto Serif SC" w:hAnsi="Noto Serif SC" w:cs="Noto Serif"/>
-          <w:sz w:val="24"/>
-          <w:szCs w:val="24"/>
-          <w:lang w:val="en-US"/>
-        </w:rPr>
-        <w:t>4</w:t>
-      </w:r>
-      <w:r>
-        <w:rPr>
-          <w:rFonts w:ascii="Noto Serif SC" w:eastAsia="Noto Serif SC" w:hAnsi="Noto Serif SC" w:cs="Noto Serif" w:hint="eastAsia"/>
-          <w:sz w:val="24"/>
-          <w:szCs w:val="24"/>
-          <w:lang w:val="en-US"/>
-        </w:rPr>
-        <w:t>中阮</w:t>
-      </w:r>
-      <w:r>
-        <w:rPr>
-          <w:rFonts w:ascii="Noto Serif SC" w:eastAsia="Noto Serif SC" w:hAnsi="Noto Serif SC" w:cs="Noto Serif"/>
-          <w:sz w:val="24"/>
-          <w:szCs w:val="24"/>
-          <w:lang w:val="en-US"/>
-        </w:rPr>
-        <w:t xml:space="preserve"> </w:t>
-      </w:r>
-      <w:r>
-        <w:rPr>
-          <w:rFonts w:ascii="Noto Serif SC" w:eastAsia="Noto Serif SC" w:hAnsi="Noto Serif SC" w:cs="Noto Serif"/>
-          <w:sz w:val="24"/>
-          <w:szCs w:val="24"/>
-          <w:lang w:val="en-US"/>
-        </w:rPr>
-        <w:t xml:space="preserve">4 </w:t>
-      </w:r>
-      <w:r>
-        <w:rPr>
-          <w:rFonts w:ascii="Noto Serif SC" w:eastAsia="Noto Serif SC" w:hAnsi="Noto Serif SC" w:cs="Noto Serif"/>
-          <w:sz w:val="24"/>
-          <w:szCs w:val="24"/>
-          <w:lang w:val="en-US"/>
-        </w:rPr>
-        <w:t>Zhongruan</w:t>
-      </w:r>
-    </w:p>
-    <w:p>
-      <w:pPr>
-        <w:rPr>
-          <w:rFonts w:ascii="Noto Serif SC" w:eastAsia="Noto Serif SC" w:hAnsi="Noto Serif SC" w:cs="Noto Serif"/>
-          <w:sz w:val="24"/>
-          <w:szCs w:val="24"/>
-          <w:lang w:val="en-US"/>
-        </w:rPr>
-      </w:pPr>
-      <w:r>
-        <w:rPr>
-          <w:rFonts w:ascii="Noto Serif SC" w:eastAsia="Noto Serif SC" w:hAnsi="Noto Serif SC" w:cs="Noto Serif"/>
-          <w:sz w:val="24"/>
-          <w:szCs w:val="24"/>
-          <w:lang w:val="en-US"/>
-        </w:rPr>
-        <w:t>2</w:t>
-      </w:r>
-      <w:r>
-        <w:rPr>
-          <w:rFonts w:ascii="Noto Serif SC" w:eastAsia="Noto Serif SC" w:hAnsi="Noto Serif SC" w:cs="Noto Serif" w:hint="eastAsia"/>
-          <w:sz w:val="24"/>
-          <w:szCs w:val="24"/>
-          <w:lang w:val="en-US"/>
-        </w:rPr>
-        <w:t>大阮</w:t>
-      </w:r>
-      <w:r>
-        <w:rPr>
-          <w:rFonts w:ascii="Noto Serif SC" w:eastAsia="Noto Serif SC" w:hAnsi="Noto Serif SC" w:cs="Noto Serif"/>
-          <w:sz w:val="24"/>
-          <w:szCs w:val="24"/>
-          <w:lang w:val="en-US"/>
-        </w:rPr>
-        <w:t xml:space="preserve"> </w:t>
-      </w:r>
-      <w:r>
-        <w:rPr>
-          <w:rFonts w:ascii="Noto Serif SC" w:eastAsia="Noto Serif SC" w:hAnsi="Noto Serif SC" w:cs="Noto Serif"/>
-          <w:sz w:val="24"/>
-          <w:szCs w:val="24"/>
-          <w:lang w:val="en-US"/>
-        </w:rPr>
-        <w:t>2 Daruan</w:t>
-      </w:r>
-    </w:p>
-    <w:p>
-      <w:pPr>
-        <w:rPr>
-          <w:rFonts w:ascii="Noto Serif SC" w:eastAsia="Noto Serif SC" w:hAnsi="Noto Serif SC" w:cs="Noto Serif"/>
-          <w:sz w:val="24"/>
-          <w:szCs w:val="24"/>
-          <w:lang w:val="en-US"/>
-        </w:rPr>
-      </w:pPr>
-      <w:r>
-        <w:rPr>
-          <w:rFonts w:ascii="Noto Serif SC" w:eastAsia="Noto Serif SC" w:hAnsi="Noto Serif SC" w:cs="Noto Serif"/>
-          <w:sz w:val="24"/>
-          <w:szCs w:val="24"/>
-          <w:lang w:val="en-US"/>
-        </w:rPr>
-        <w:t>2</w:t>
-      </w:r>
-      <w:r>
-        <w:rPr>
-          <w:rFonts w:ascii="Noto Serif SC" w:eastAsia="Noto Serif SC" w:hAnsi="Noto Serif SC" w:cs="Noto Serif"/>
-          <w:sz w:val="24"/>
-          <w:szCs w:val="24"/>
-          <w:lang w:val="en-US"/>
-        </w:rPr>
-        <w:t xml:space="preserve"> </w:t>
-      </w:r>
-      <w:r>
-        <w:rPr>
-          <w:rFonts w:ascii="Noto Serif SC" w:eastAsia="Noto Serif SC" w:hAnsi="Noto Serif SC" w:cs="Noto Serif" w:hint="eastAsia"/>
-          <w:sz w:val="24"/>
-          <w:szCs w:val="24"/>
-        </w:rPr>
-        <w:t>古筝</w:t>
-      </w:r>
-      <w:r>
-        <w:rPr>
-          <w:rFonts w:ascii="Noto Serif SC" w:eastAsia="Noto Serif SC" w:hAnsi="Noto Serif SC" w:cs="Noto Serif"/>
-          <w:sz w:val="24"/>
-          <w:szCs w:val="24"/>
-          <w:lang w:val="en-US"/>
-        </w:rPr>
-        <w:t xml:space="preserve"> </w:t>
-      </w:r>
-      <w:r>
-        <w:rPr>
-          <w:rFonts w:ascii="Noto Serif SC" w:eastAsia="Noto Serif SC" w:hAnsi="Noto Serif SC" w:cs="Noto Serif"/>
-          <w:sz w:val="24"/>
-          <w:szCs w:val="24"/>
-          <w:lang w:val="en-US"/>
-        </w:rPr>
-        <w:t xml:space="preserve">2 </w:t>
-      </w:r>
-      <w:r>
-        <w:rPr>
-          <w:rFonts w:ascii="Noto Serif SC" w:eastAsia="Noto Serif SC" w:hAnsi="Noto Serif SC" w:cs="Noto Serif"/>
-          <w:sz w:val="24"/>
-          <w:szCs w:val="24"/>
-          <w:lang w:val="en-US"/>
-        </w:rPr>
-        <w:t>Guzheng</w:t>
-      </w:r>
-    </w:p>
-    <w:p>
-      <w:pPr>
-        <w:rPr>
-          <w:rFonts w:ascii="Noto Serif SC" w:eastAsia="Noto Serif SC" w:hAnsi="Noto Serif SC" w:cs="Noto Serif"/>
-          <w:sz w:val="24"/>
-          <w:szCs w:val="24"/>
-          <w:lang w:val="en-US"/>
-        </w:rPr>
-      </w:pPr>
-    </w:p>
-    <w:p>
-      <w:pPr>
-        <w:rPr>
-          <w:rFonts w:ascii="Noto Serif SC" w:eastAsia="Noto Serif SC" w:hAnsi="Noto Serif SC" w:cs="Noto Serif"/>
-          <w:sz w:val="24"/>
-          <w:szCs w:val="24"/>
-          <w:lang w:val="en-US"/>
-        </w:rPr>
-      </w:pPr>
-      <w:r>
-        <w:rPr>
-          <w:rFonts w:ascii="Noto Serif SC" w:eastAsia="Noto Serif SC" w:hAnsi="Noto Serif SC" w:cs="Noto Serif"/>
-          <w:sz w:val="24"/>
-          <w:szCs w:val="24"/>
-          <w:lang w:val="en-US"/>
-        </w:rPr>
-        <w:t>1</w:t>
-      </w:r>
-      <w:r>
-        <w:rPr>
-          <w:rFonts w:ascii="Noto Serif SC" w:eastAsia="Noto Serif SC" w:hAnsi="Noto Serif SC" w:cs="Noto Serif" w:hint="eastAsia"/>
-          <w:sz w:val="24"/>
-          <w:szCs w:val="24"/>
-        </w:rPr>
-        <w:t>定音鼓</w:t>
-      </w:r>
-      <w:r>
-        <w:rPr>
-          <w:rFonts w:ascii="Noto Serif SC" w:eastAsia="Noto Serif SC" w:hAnsi="Noto Serif SC" w:cs="Noto Serif"/>
-          <w:sz w:val="24"/>
-          <w:szCs w:val="24"/>
-          <w:lang w:val="en-US"/>
-        </w:rPr>
-        <w:t xml:space="preserve"> Timpani</w:t>
-      </w:r>
-    </w:p>
-    <w:p>
-      <w:pPr>
-        <w:rPr>
-          <w:rFonts w:ascii="Noto Serif SC" w:eastAsia="Noto Serif SC" w:hAnsi="Noto Serif SC" w:cs="Noto Serif"/>
-          <w:sz w:val="24"/>
-          <w:szCs w:val="24"/>
-          <w:lang w:val="en-US"/>
-        </w:rPr>
-      </w:pPr>
-      <w:r>
-        <w:rPr>
-          <w:rFonts w:ascii="Noto Serif SC" w:eastAsia="Noto Serif SC" w:hAnsi="Noto Serif SC" w:cs="Noto Serif"/>
-          <w:sz w:val="24"/>
-          <w:szCs w:val="24"/>
-        </w:rPr>
-        <w:t>4</w:t>
-      </w:r>
-      <w:r>
-        <w:rPr>
-          <w:rFonts w:ascii="Noto Serif SC" w:eastAsia="Noto Serif SC" w:hAnsi="Noto Serif SC" w:cs="Noto Serif" w:hint="eastAsia"/>
-          <w:sz w:val="24"/>
-          <w:szCs w:val="24"/>
-        </w:rPr>
-        <w:t xml:space="preserve"> 打击乐 </w:t>
-      </w:r>
-      <w:r>
-        <w:rPr>
-          <w:rFonts w:ascii="Noto Serif SC" w:eastAsia="Noto Serif SC" w:hAnsi="Noto Serif SC" w:cs="Noto Serif"/>
-          <w:sz w:val="24"/>
-          <w:szCs w:val="24"/>
-        </w:rPr>
-        <w:t>4</w:t>
-      </w:r>
-      <w:r>
-        <w:rPr>
-          <w:rFonts w:ascii="Noto Serif SC" w:eastAsia="Noto Serif SC" w:hAnsi="Noto Serif SC" w:cs="Noto Serif"/>
-          <w:sz w:val="24"/>
-          <w:szCs w:val="24"/>
-        </w:rPr>
-        <w:t xml:space="preserve"> Percussion</w:t>
-      </w:r>
-    </w:p>
-    <w:p>
-      <w:pPr>
-        <w:rPr>
-          <w:rFonts w:ascii="Noto Serif SC" w:eastAsia="Noto Serif SC" w:hAnsi="Noto Serif SC" w:cs="Noto Serif"/>
-          <w:sz w:val="20"/>
-          <w:szCs w:val="20"/>
-          <w:lang w:val="en-US"/>
-        </w:rPr>
-      </w:pPr>
-      <w:r>
-        <w:rPr>
-          <w:rFonts w:ascii="Noto Serif SC" w:eastAsia="Noto Serif SC" w:hAnsi="Noto Serif SC" w:cs="Noto Serif"/>
-          <w:sz w:val="20"/>
-          <w:szCs w:val="20"/>
-          <w:lang w:val="en-US"/>
-        </w:rPr>
-        <w:t xml:space="preserve">I: </w:t>
-      </w:r>
-      <w:r>
-        <w:rPr>
-          <w:rFonts w:ascii="Noto Serif SC" w:eastAsia="Noto Serif SC" w:hAnsi="Noto Serif SC" w:cs="Noto Serif" w:hint="eastAsia"/>
-          <w:sz w:val="20"/>
-          <w:szCs w:val="20"/>
-        </w:rPr>
-        <w:t>大军鼓</w:t>
-      </w:r>
-      <w:r>
-        <w:rPr>
-          <w:rFonts w:ascii="Noto Serif SC" w:eastAsia="Noto Serif SC" w:hAnsi="Noto Serif SC" w:cs="Noto Serif"/>
-          <w:sz w:val="20"/>
-          <w:szCs w:val="20"/>
-        </w:rPr>
-        <w:t xml:space="preserve"> Bass Drum, </w:t>
-      </w:r>
-      <w:r>
-        <w:rPr>
-          <w:rFonts w:ascii="Noto Serif SC" w:eastAsia="Noto Serif SC" w:hAnsi="Noto Serif SC" w:cs="Noto Serif" w:hint="eastAsia"/>
-          <w:sz w:val="20"/>
-          <w:szCs w:val="20"/>
-        </w:rPr>
-        <w:t>板鼓</w:t>
-      </w:r>
-      <w:r>
-        <w:rPr>
-          <w:rFonts w:ascii="Noto Serif SC" w:eastAsia="Noto Serif SC" w:hAnsi="Noto Serif SC" w:cs="Noto Serif"/>
-          <w:sz w:val="20"/>
-          <w:szCs w:val="20"/>
-        </w:rPr>
-        <w:t xml:space="preserve"> Bangu</w:t>
-      </w:r>
-    </w:p>
-    <w:p>
-      <w:pPr>
-        <w:rPr>
-          <w:rFonts w:ascii="Noto Serif SC" w:eastAsia="Noto Serif SC" w:hAnsi="Noto Serif SC" w:cs="Noto Serif"/>
-          <w:sz w:val="20"/>
-          <w:szCs w:val="20"/>
-        </w:rPr>
-      </w:pPr>
-      <w:r>
-        <w:rPr>
-          <w:rFonts w:ascii="Noto Serif SC" w:eastAsia="Noto Serif SC" w:hAnsi="Noto Serif SC" w:cs="Noto Serif"/>
-          <w:sz w:val="20"/>
-          <w:szCs w:val="20"/>
-          <w:lang w:val="en-US"/>
-        </w:rPr>
-        <w:t xml:space="preserve">II: </w:t>
-      </w:r>
-      <w:r>
-        <w:rPr>
-          <w:rFonts w:ascii="Noto Serif SC" w:eastAsia="Noto Serif SC" w:hAnsi="Noto Serif SC" w:cs="Noto Serif" w:hint="eastAsia"/>
-          <w:sz w:val="20"/>
-          <w:szCs w:val="20"/>
-        </w:rPr>
-        <w:t>吊镲</w:t>
-      </w:r>
-      <w:r>
-        <w:rPr>
-          <w:rFonts w:ascii="Noto Serif SC" w:eastAsia="Noto Serif SC" w:hAnsi="Noto Serif SC" w:cs="Noto Serif"/>
-          <w:sz w:val="20"/>
-          <w:szCs w:val="20"/>
-        </w:rPr>
-        <w:t xml:space="preserve"> Suspended Cymbal, </w:t>
-      </w:r>
-      <w:r>
-        <w:rPr>
-          <w:rFonts w:ascii="Noto Serif SC" w:eastAsia="Noto Serif SC" w:hAnsi="Noto Serif SC" w:cs="Noto Serif" w:hint="eastAsia"/>
-          <w:sz w:val="20"/>
-          <w:szCs w:val="20"/>
-        </w:rPr>
-        <w:t>碰铃</w:t>
-      </w:r>
-      <w:r>
-        <w:rPr>
-          <w:rFonts w:ascii="Noto Serif SC" w:eastAsia="Noto Serif SC" w:hAnsi="Noto Serif SC" w:cs="Noto Serif"/>
-          <w:sz w:val="20"/>
-          <w:szCs w:val="20"/>
-        </w:rPr>
-        <w:t xml:space="preserve"> </w:t>
-      </w:r>
-      <w:proofErr w:type="spellStart"/>
-      <w:r>
-        <w:rPr>
-          <w:rFonts w:ascii="Noto Serif SC" w:eastAsia="Noto Serif SC" w:hAnsi="Noto Serif SC" w:cs="Noto Serif"/>
-          <w:sz w:val="20"/>
-          <w:szCs w:val="20"/>
-        </w:rPr>
-        <w:t>Pengling</w:t>
-      </w:r>
-      <w:proofErr w:type="spellEnd"/>
       <w:r>
         <w:rPr>
           <w:rFonts w:ascii="Noto Serif SC" w:eastAsia="Noto Serif SC" w:hAnsi="Noto Serif SC" w:cs="Noto Serif"/>
@@ -3041,270 +3288,6 @@
           <w:sz w:val="20"/>
           <w:szCs w:val="20"/>
         </w:rPr>
-        <w:t>低音木鱼</w:t>
-      </w:r>
-      <w:r>
-        <w:rPr>
-          <w:rFonts w:ascii="Noto Serif SC" w:eastAsia="Noto Serif SC" w:hAnsi="Noto Serif SC" w:cs="Noto Serif"/>
-          <w:sz w:val="20"/>
-          <w:szCs w:val="20"/>
-        </w:rPr>
-        <w:t xml:space="preserve"> Low Woodblock</w:t>
-      </w:r>
-    </w:p>
-    <w:p>
-      <w:pPr>
-        <w:rPr>
-          <w:rFonts w:ascii="Noto Serif SC" w:eastAsia="Noto Serif SC" w:hAnsi="Noto Serif SC" w:cs="Noto Serif"/>
-          <w:sz w:val="20"/>
-          <w:szCs w:val="20"/>
-        </w:rPr>
-      </w:pPr>
-      <w:r>
-        <w:rPr>
-          <w:rFonts w:ascii="Noto Serif SC" w:eastAsia="Noto Serif SC" w:hAnsi="Noto Serif SC" w:cs="Noto Serif"/>
-          <w:sz w:val="20"/>
-          <w:szCs w:val="20"/>
-          <w:lang w:val="en-US"/>
-        </w:rPr>
-        <w:t xml:space="preserve">III: </w:t>
-      </w:r>
-      <w:r>
-        <w:rPr>
-          <w:rFonts w:ascii="Noto Serif SC" w:eastAsia="Noto Serif SC" w:hAnsi="Noto Serif SC" w:cs="Noto Serif" w:hint="eastAsia"/>
-          <w:sz w:val="20"/>
-          <w:szCs w:val="20"/>
-          <w:lang w:val="en-US"/>
-        </w:rPr>
-        <w:t>小军鼓</w:t>
-      </w:r>
-      <w:r>
-        <w:rPr>
-          <w:rFonts w:ascii="Noto Serif SC" w:eastAsia="Noto Serif SC" w:hAnsi="Noto Serif SC" w:cs="Noto Serif"/>
-          <w:sz w:val="20"/>
-          <w:szCs w:val="20"/>
-          <w:lang w:val="en-US"/>
-        </w:rPr>
-        <w:t xml:space="preserve"> Snare Drum, </w:t>
-      </w:r>
-      <w:r>
-        <w:rPr>
-          <w:rFonts w:ascii="Noto Serif SC" w:eastAsia="Noto Serif SC" w:hAnsi="Noto Serif SC" w:cs="Noto Serif" w:hint="eastAsia"/>
-          <w:sz w:val="20"/>
-          <w:szCs w:val="20"/>
-        </w:rPr>
-        <w:t>铃鼓</w:t>
-      </w:r>
-      <w:r>
-        <w:rPr>
-          <w:rFonts w:ascii="Noto Serif SC" w:eastAsia="Noto Serif SC" w:hAnsi="Noto Serif SC" w:cs="Noto Serif"/>
-          <w:sz w:val="20"/>
-          <w:szCs w:val="20"/>
-        </w:rPr>
-        <w:t xml:space="preserve"> Tambourine, </w:t>
-      </w:r>
-      <w:r>
-        <w:rPr>
-          <w:rFonts w:ascii="Noto Serif SC" w:eastAsia="Noto Serif SC" w:hAnsi="Noto Serif SC" w:cs="Noto Serif" w:hint="eastAsia"/>
-          <w:sz w:val="20"/>
-          <w:szCs w:val="20"/>
-        </w:rPr>
-        <w:t>钟琴</w:t>
-      </w:r>
-      <w:r>
-        <w:rPr>
-          <w:rFonts w:ascii="Noto Serif SC" w:eastAsia="Noto Serif SC" w:hAnsi="Noto Serif SC" w:cs="Noto Serif"/>
-          <w:sz w:val="20"/>
-          <w:szCs w:val="20"/>
-        </w:rPr>
-        <w:t xml:space="preserve"> Glockenspiel, </w:t>
-      </w:r>
-      <w:r>
-        <w:rPr>
-          <w:rFonts w:ascii="Noto Serif SC" w:eastAsia="Noto Serif SC" w:hAnsi="Noto Serif SC" w:cs="Noto Serif" w:hint="eastAsia"/>
-          <w:sz w:val="20"/>
-          <w:szCs w:val="20"/>
-        </w:rPr>
-        <w:t>小钹</w:t>
-      </w:r>
-      <w:r>
-        <w:rPr>
-          <w:rFonts w:ascii="Noto Serif SC" w:eastAsia="Noto Serif SC" w:hAnsi="Noto Serif SC" w:cs="Noto Serif"/>
-          <w:sz w:val="20"/>
-          <w:szCs w:val="20"/>
-        </w:rPr>
-        <w:t xml:space="preserve"> Xiaobo, </w:t>
-      </w:r>
-      <w:r>
-        <w:rPr>
-          <w:rFonts w:ascii="Noto Serif SC" w:eastAsia="Noto Serif SC" w:hAnsi="Noto Serif SC" w:cs="Noto Serif" w:hint="eastAsia"/>
-          <w:sz w:val="20"/>
-          <w:szCs w:val="20"/>
-        </w:rPr>
-        <w:t>小堂鼓</w:t>
-      </w:r>
-      <w:r>
-        <w:rPr>
-          <w:rFonts w:ascii="Noto Serif SC" w:eastAsia="Noto Serif SC" w:hAnsi="Noto Serif SC" w:cs="Noto Serif"/>
-          <w:sz w:val="20"/>
-          <w:szCs w:val="20"/>
-        </w:rPr>
-        <w:t xml:space="preserve"> </w:t>
-      </w:r>
-      <w:proofErr w:type="spellStart"/>
-      <w:r>
-        <w:rPr>
-          <w:rFonts w:ascii="Noto Serif SC" w:eastAsia="Noto Serif SC" w:hAnsi="Noto Serif SC" w:cs="Noto Serif"/>
-          <w:sz w:val="20"/>
-          <w:szCs w:val="20"/>
-        </w:rPr>
-        <w:t>Xiaotanggu</w:t>
-      </w:r>
-      <w:proofErr w:type="spellEnd"/>
-    </w:p>
-    <w:p>
-      <w:pPr>
-        <w:rPr>
-          <w:rFonts w:ascii="Noto Serif SC" w:eastAsia="Noto Serif SC" w:hAnsi="Noto Serif SC" w:cs="Noto Serif"/>
-          <w:sz w:val="20"/>
-          <w:szCs w:val="20"/>
-          <w:lang w:val="en-US"/>
-        </w:rPr>
-      </w:pPr>
-      <w:r>
-        <w:rPr>
-          <w:rFonts w:ascii="Noto Serif SC" w:eastAsia="Noto Serif SC" w:hAnsi="Noto Serif SC" w:cs="Noto Serif"/>
-          <w:sz w:val="20"/>
-          <w:szCs w:val="20"/>
-          <w:lang w:val="en-US"/>
-        </w:rPr>
-        <w:t xml:space="preserve">IV: </w:t>
-      </w:r>
-      <w:r>
-        <w:rPr>
-          <w:rFonts w:ascii="Noto Serif SC" w:eastAsia="Noto Serif SC" w:hAnsi="Noto Serif SC" w:cs="Noto Serif" w:hint="eastAsia"/>
-          <w:sz w:val="20"/>
-          <w:szCs w:val="20"/>
-        </w:rPr>
-        <w:t>鞭子</w:t>
-      </w:r>
-      <w:r>
-        <w:rPr>
-          <w:rFonts w:ascii="Noto Serif SC" w:eastAsia="Noto Serif SC" w:hAnsi="Noto Serif SC" w:cs="Noto Serif"/>
-          <w:sz w:val="20"/>
-          <w:szCs w:val="20"/>
-        </w:rPr>
-        <w:t xml:space="preserve"> Whip, </w:t>
-      </w:r>
-      <w:r>
-        <w:rPr>
-          <w:rFonts w:ascii="Noto Serif SC" w:eastAsia="Noto Serif SC" w:hAnsi="Noto Serif SC" w:cs="Noto Serif" w:hint="eastAsia"/>
-          <w:sz w:val="20"/>
-          <w:szCs w:val="20"/>
-        </w:rPr>
-        <w:t>中钹</w:t>
-      </w:r>
-      <w:r>
-        <w:rPr>
-          <w:rFonts w:ascii="Noto Serif SC" w:eastAsia="Noto Serif SC" w:hAnsi="Noto Serif SC" w:cs="Noto Serif"/>
-          <w:sz w:val="20"/>
-          <w:szCs w:val="20"/>
-        </w:rPr>
-        <w:t xml:space="preserve"> </w:t>
-      </w:r>
-      <w:proofErr w:type="spellStart"/>
-      <w:r>
-        <w:rPr>
-          <w:rFonts w:ascii="Noto Serif SC" w:eastAsia="Noto Serif SC" w:hAnsi="Noto Serif SC" w:cs="Noto Serif"/>
-          <w:sz w:val="20"/>
-          <w:szCs w:val="20"/>
-        </w:rPr>
-        <w:t>Zhongbo</w:t>
-      </w:r>
-      <w:proofErr w:type="spellEnd"/>
-      <w:r>
-        <w:rPr>
-          <w:rFonts w:ascii="Noto Serif SC" w:eastAsia="Noto Serif SC" w:hAnsi="Noto Serif SC" w:cs="Noto Serif"/>
-          <w:sz w:val="20"/>
-          <w:szCs w:val="20"/>
-        </w:rPr>
-        <w:t xml:space="preserve">, </w:t>
-      </w:r>
-      <w:r>
-        <w:rPr>
-          <w:rFonts w:ascii="Noto Serif SC" w:eastAsia="Noto Serif SC" w:hAnsi="Noto Serif SC" w:cs="Noto Serif" w:hint="eastAsia"/>
-          <w:sz w:val="20"/>
-          <w:szCs w:val="20"/>
-        </w:rPr>
-        <w:t>中国小钹</w:t>
-      </w:r>
-      <w:r>
-        <w:rPr>
-          <w:rFonts w:ascii="Noto Serif SC" w:eastAsia="Noto Serif SC" w:hAnsi="Noto Serif SC" w:cs="Noto Serif"/>
-          <w:sz w:val="20"/>
-          <w:szCs w:val="20"/>
-          <w:lang w:val="en-GB"/>
-        </w:rPr>
-        <w:t xml:space="preserve"> </w:t>
-      </w:r>
-      <w:proofErr w:type="spellStart"/>
-      <w:r>
-        <w:rPr>
-          <w:rFonts w:ascii="Noto Serif SC" w:eastAsia="Noto Serif SC" w:hAnsi="Noto Serif SC" w:cs="Noto Serif"/>
-          <w:sz w:val="20"/>
-          <w:szCs w:val="20"/>
-        </w:rPr>
-        <w:t>Xiaoluo</w:t>
-      </w:r>
-      <w:proofErr w:type="spellEnd"/>
-      <w:r>
-        <w:rPr>
-          <w:rFonts w:ascii="Noto Serif SC" w:eastAsia="Noto Serif SC" w:hAnsi="Noto Serif SC" w:cs="Noto Serif"/>
-          <w:sz w:val="20"/>
-          <w:szCs w:val="20"/>
-        </w:rPr>
-        <w:t xml:space="preserve">, </w:t>
-      </w:r>
-      <w:r>
-        <w:rPr>
-          <w:rFonts w:ascii="Noto Serif SC" w:eastAsia="Noto Serif SC" w:hAnsi="Noto Serif SC" w:cs="Noto Serif" w:hint="eastAsia"/>
-          <w:sz w:val="20"/>
-          <w:szCs w:val="20"/>
-        </w:rPr>
-        <w:t>中国大钹</w:t>
-      </w:r>
-      <w:r>
-        <w:rPr>
-          <w:rFonts w:ascii="Noto Serif SC" w:eastAsia="Noto Serif SC" w:hAnsi="Noto Serif SC" w:cs="Noto Serif"/>
-          <w:sz w:val="20"/>
-          <w:szCs w:val="20"/>
-        </w:rPr>
-        <w:t xml:space="preserve"> </w:t>
-      </w:r>
-      <w:proofErr w:type="spellStart"/>
-      <w:r>
-        <w:rPr>
-          <w:rFonts w:ascii="Noto Serif SC" w:eastAsia="Noto Serif SC" w:hAnsi="Noto Serif SC" w:cs="Noto Serif"/>
-          <w:sz w:val="20"/>
-          <w:szCs w:val="20"/>
-        </w:rPr>
-        <w:t>Daluo</w:t>
-      </w:r>
-      <w:proofErr w:type="spellEnd"/>
-      <w:r>
-        <w:rPr>
-          <w:rFonts w:ascii="Noto Serif SC" w:eastAsia="Noto Serif SC" w:hAnsi="Noto Serif SC" w:cs="Noto Serif"/>
-          <w:sz w:val="20"/>
-          <w:szCs w:val="20"/>
-        </w:rPr>
-        <w:t xml:space="preserve">, </w:t>
-      </w:r>
-      <w:r>
-        <w:rPr>
-          <w:rFonts w:ascii="Noto Serif SC" w:eastAsia="Noto Serif SC" w:hAnsi="Noto Serif SC" w:cs="Noto Serif" w:hint="eastAsia"/>
-          <w:sz w:val="20"/>
-          <w:szCs w:val="20"/>
-        </w:rPr>
         <w:t>西洋对镲</w:t>
       </w:r>
       <w:r>
@@ -3318,6 +3301,7 @@
     </w:p>
     <w:p>
       <w:pPr>
+        <w:ind w:hanging="436"/>
         <w:rPr>
           <w:rFonts w:ascii="Noto Serif SC" w:eastAsia="Noto Serif SC" w:hAnsi="Noto Serif SC" w:cs="Noto Serif"/>
           <w:sz w:val="24"/>
@@ -3425,16 +3409,7 @@
           <w:szCs w:val="24"/>
           <w:lang w:val="en-US"/>
         </w:rPr>
-        <w:t xml:space="preserve"> I</w:t>
-      </w:r>
-      <w:r>
-        <w:rPr>
-          <w:rFonts w:ascii="Noto Serif SC" w:eastAsia="Noto Serif SC" w:hAnsi="Noto Serif SC" w:cs="Noto Serif"/>
-          <w:sz w:val="24"/>
-          <w:szCs w:val="24"/>
-          <w:lang w:val="en-US"/>
-        </w:rPr>
-        <w:t>I</w:t>
+        <w:t xml:space="preserve"> II</w:t>
       </w:r>
     </w:p>
     <w:p>
@@ -3523,6 +3498,7 @@
     </w:p>
     <w:p>
       <w:pPr>
+        <w:jc w:val="right"/>
         <w:rPr>
           <w:rFonts w:ascii="Noto Serif SC" w:eastAsia="Noto Serif SC" w:hAnsi="Noto Serif SC" w:cs="Noto Serif"/>
           <w:lang w:val="en-US"/>

</xml_diff>

<commit_message>
Added some fonts. Minor formatting changes to Front Matter (1-9). 4 now B4. Edit to Piece 4 and 9
</commit_message>
<xml_diff>
--- a/Front Matter/Template/1_Front-Matter.docx
+++ b/Front Matter/Template/1_Front-Matter.docx
@@ -33,67 +33,7 @@
           <w:szCs w:val="60"/>
           <w:lang w:val="en-US"/>
         </w:rPr>
-        <w:t>狮</w:t>
-      </w:r>
-      <w:r>
-        <w:rPr>
-          <w:rFonts w:ascii="Noto Serif SC" w:eastAsia="Noto Serif SC" w:hAnsi="Noto Serif SC" w:cs="Noto Serif"/>
-          <w:b/>
-          <w:sz w:val="60"/>
-          <w:szCs w:val="60"/>
-          <w:lang w:val="en-US"/>
-        </w:rPr>
-        <w:t xml:space="preserve"> </w:t>
-      </w:r>
-      <w:r>
-        <w:rPr>
-          <w:rFonts w:ascii="Noto Serif SC" w:eastAsia="Noto Serif SC" w:hAnsi="Noto Serif SC" w:cs="Noto Serif" w:hint="eastAsia"/>
-          <w:b/>
-          <w:sz w:val="60"/>
-          <w:szCs w:val="60"/>
-          <w:lang w:val="en-US"/>
-        </w:rPr>
-        <w:t>城</w:t>
-      </w:r>
-      <w:r>
-        <w:rPr>
-          <w:rFonts w:ascii="Noto Serif SC" w:eastAsia="Noto Serif SC" w:hAnsi="Noto Serif SC" w:cs="Noto Serif"/>
-          <w:b/>
-          <w:sz w:val="60"/>
-          <w:szCs w:val="60"/>
-          <w:lang w:val="en-US"/>
-        </w:rPr>
-        <w:t xml:space="preserve"> </w:t>
-      </w:r>
-      <w:r>
-        <w:rPr>
-          <w:rFonts w:ascii="Noto Serif SC" w:eastAsia="Noto Serif SC" w:hAnsi="Noto Serif SC" w:cs="Noto Serif" w:hint="eastAsia"/>
-          <w:b/>
-          <w:sz w:val="60"/>
-          <w:szCs w:val="60"/>
-          <w:lang w:val="en-US"/>
-        </w:rPr>
-        <w:t>漫</w:t>
-      </w:r>
-      <w:r>
-        <w:rPr>
-          <w:rFonts w:ascii="Noto Serif SC" w:eastAsia="Noto Serif SC" w:hAnsi="Noto Serif SC" w:cs="Noto Serif"/>
-          <w:b/>
-          <w:sz w:val="60"/>
-          <w:szCs w:val="60"/>
-          <w:lang w:val="en-US"/>
-        </w:rPr>
-        <w:t xml:space="preserve"> </w:t>
-      </w:r>
-      <w:r>
-        <w:rPr>
-          <w:rFonts w:ascii="Noto Serif SC" w:eastAsia="Noto Serif SC" w:hAnsi="Noto Serif SC" w:cs="Noto Serif" w:hint="eastAsia"/>
-          <w:b/>
-          <w:sz w:val="60"/>
-          <w:szCs w:val="60"/>
-          <w:lang w:val="en-US"/>
-        </w:rPr>
-        <w:t>步</w:t>
+        <w:t>狮城漫步</w:t>
       </w:r>
     </w:p>
     <w:p>
@@ -668,6 +608,8 @@
           <w:b/>
           <w:bCs/>
           <w:color w:val="000000" w:themeColor="text1"/>
+          <w:sz w:val="24"/>
+          <w:szCs w:val="24"/>
           <w:lang w:val="en-GB"/>
         </w:rPr>
       </w:pPr>
@@ -677,6 +619,8 @@
           <w:b/>
           <w:bCs/>
           <w:color w:val="000000" w:themeColor="text1"/>
+          <w:sz w:val="24"/>
+          <w:szCs w:val="24"/>
         </w:rPr>
         <w:lastRenderedPageBreak/>
         <w:t>狮城漫步</w:t>
@@ -902,11 +846,15 @@
       <w:pPr>
         <w:rPr>
           <w:rFonts w:ascii="Noto Serif SC" w:eastAsia="Noto Serif SC" w:hAnsi="Noto Serif SC" w:cs="Noto Serif"/>
-        </w:rPr>
-      </w:pPr>
-      <w:r>
-        <w:rPr>
-          <w:rFonts w:ascii="Noto Serif SC" w:eastAsia="Noto Serif SC" w:hAnsi="Noto Serif SC" w:cs="Noto Serif"/>
+          <w:sz w:val="20"/>
+          <w:szCs w:val="20"/>
+        </w:rPr>
+      </w:pPr>
+      <w:r>
+        <w:rPr>
+          <w:rFonts w:ascii="Noto Serif SC" w:eastAsia="Noto Serif SC" w:hAnsi="Noto Serif SC" w:cs="Noto Serif"/>
+          <w:sz w:val="20"/>
+          <w:szCs w:val="20"/>
         </w:rPr>
         <w:t>Printed in Singapore.</w:t>
       </w:r>
@@ -2448,13 +2396,23 @@
         </w:rPr>
         <w:t xml:space="preserve">1 </w:t>
       </w:r>
-      <w:r>
-        <w:rPr>
-          <w:rFonts w:ascii="Noto Serif SC" w:eastAsia="Noto Serif SC" w:hAnsi="Noto Serif SC" w:cs="Noto Serif"/>
-          <w:sz w:val="24"/>
-          <w:szCs w:val="24"/>
-        </w:rPr>
-        <w:t xml:space="preserve">Diyin </w:t>
+      <w:proofErr w:type="spellStart"/>
+      <w:r>
+        <w:rPr>
+          <w:rFonts w:ascii="Noto Serif SC" w:eastAsia="Noto Serif SC" w:hAnsi="Noto Serif SC" w:cs="Noto Serif"/>
+          <w:sz w:val="24"/>
+          <w:szCs w:val="24"/>
+        </w:rPr>
+        <w:t>Diyin</w:t>
+      </w:r>
+      <w:proofErr w:type="spellEnd"/>
+      <w:r>
+        <w:rPr>
+          <w:rFonts w:ascii="Noto Serif SC" w:eastAsia="Noto Serif SC" w:hAnsi="Noto Serif SC" w:cs="Noto Serif"/>
+          <w:sz w:val="24"/>
+          <w:szCs w:val="24"/>
+        </w:rPr>
+        <w:t xml:space="preserve"> </w:t>
       </w:r>
       <w:proofErr w:type="spellStart"/>
       <w:r>

</xml_diff>

<commit_message>
Piece 1 - Edits to commas
</commit_message>
<xml_diff>
--- a/Front Matter/Template/1_Front-Matter.docx
+++ b/Front Matter/Template/1_Front-Matter.docx
@@ -1355,15 +1355,15 @@
     <w:p>
       <w:pPr>
         <w:rPr>
-          <w:rFonts w:ascii="Noto Serif SC" w:eastAsia="Noto Serif SC" w:hAnsi="Noto Serif SC"/>
-          <w:sz w:val="24"/>
-          <w:szCs w:val="24"/>
-          <w:lang w:val="en-US"/>
-        </w:rPr>
-      </w:pPr>
-      <w:r>
-        <w:rPr>
-          <w:rFonts w:ascii="Noto Serif SC" w:eastAsia="Noto Serif SC" w:hAnsi="Noto Serif SC"/>
+          <w:rFonts w:ascii="Noto Serif CJK SC" w:eastAsia="Noto Serif CJK SC" w:hAnsi="Noto Serif CJK SC"/>
+          <w:sz w:val="24"/>
+          <w:szCs w:val="24"/>
+          <w:lang w:val="en-US"/>
+        </w:rPr>
+      </w:pPr>
+      <w:r>
+        <w:rPr>
+          <w:rFonts w:ascii="Noto Serif CJK SC" w:eastAsia="Noto Serif CJK SC" w:hAnsi="Noto Serif CJK SC"/>
           <w:sz w:val="24"/>
           <w:szCs w:val="24"/>
           <w:lang w:val="en-US"/>
@@ -1373,7 +1373,7 @@
       <w:proofErr w:type="spellStart"/>
       <w:r>
         <w:rPr>
-          <w:rFonts w:ascii="Noto Serif SC" w:eastAsia="Noto Serif SC" w:hAnsi="Noto Serif SC"/>
+          <w:rFonts w:ascii="Noto Serif CJK SC" w:eastAsia="Noto Serif CJK SC" w:hAnsi="Noto Serif CJK SC"/>
           <w:sz w:val="24"/>
           <w:szCs w:val="24"/>
           <w:lang w:val="en-US"/>
@@ -1383,7 +1383,7 @@
       <w:proofErr w:type="spellEnd"/>
       <w:r>
         <w:rPr>
-          <w:rFonts w:ascii="Noto Serif SC" w:eastAsia="Noto Serif SC" w:hAnsi="Noto Serif SC"/>
+          <w:rFonts w:ascii="Noto Serif CJK SC" w:eastAsia="Noto Serif CJK SC" w:hAnsi="Noto Serif CJK SC"/>
           <w:sz w:val="24"/>
           <w:szCs w:val="24"/>
           <w:lang w:val="en-US"/>
@@ -1393,7 +1393,7 @@
       <w:proofErr w:type="spellStart"/>
       <w:r>
         <w:rPr>
-          <w:rFonts w:ascii="Noto Serif SC" w:eastAsia="Noto Serif SC" w:hAnsi="Noto Serif SC"/>
+          <w:rFonts w:ascii="Noto Serif CJK SC" w:eastAsia="Noto Serif CJK SC" w:hAnsi="Noto Serif CJK SC"/>
           <w:sz w:val="24"/>
           <w:szCs w:val="24"/>
           <w:lang w:val="en-US"/>
@@ -1403,30 +1403,12 @@
       <w:proofErr w:type="spellEnd"/>
       <w:r>
         <w:rPr>
-          <w:rFonts w:ascii="Noto Serif SC" w:eastAsia="Noto Serif SC" w:hAnsi="Noto Serif SC"/>
-          <w:sz w:val="24"/>
-          <w:szCs w:val="24"/>
-          <w:lang w:val="en-US"/>
-        </w:rPr>
-        <w:t xml:space="preserve"> descent. He learnt to compose and to play the dulcimer, violin and piano from his father during his childhood, and was admitted to the Shanghai Conservatory of Music Composition and Conducting Department in 1991 to study composition under the tutelage of Professor Wang Jianzhong. He teaches in the Composition Department of Middle School Affiliated to </w:t>
-      </w:r>
-      <w:r>
-        <w:rPr>
-          <w:rFonts w:ascii="Noto Serif SC" w:eastAsia="Noto Serif SC" w:hAnsi="Noto Serif SC"/>
-          <w:sz w:val="24"/>
-          <w:szCs w:val="24"/>
-          <w:lang w:val="en-US"/>
-        </w:rPr>
-        <w:t>Shanghai Conservatory</w:t>
-      </w:r>
-      <w:r>
-        <w:rPr>
-          <w:rFonts w:ascii="Noto Serif SC" w:eastAsia="Noto Serif SC" w:hAnsi="Noto Serif SC"/>
-          <w:sz w:val="24"/>
-          <w:szCs w:val="24"/>
-          <w:lang w:val="en-US"/>
-        </w:rPr>
-        <w:t xml:space="preserve"> of music and is actively engaged in various fields of composition. His works include symphonies, chamber music, choral music and musicals etc. His distinctive personal style is expressed through diverse genres such as modern, classical, pop, folk, religious and electronic music.</w:t>
+          <w:rFonts w:ascii="Noto Serif CJK SC" w:eastAsia="Noto Serif CJK SC" w:hAnsi="Noto Serif CJK SC"/>
+          <w:sz w:val="24"/>
+          <w:szCs w:val="24"/>
+          <w:lang w:val="en-US"/>
+        </w:rPr>
+        <w:t xml:space="preserve"> descent. He learnt to compose and to play the dulcimer, violin and piano from his father during his childhood, and was admitted to the Shanghai Conservatory of Music Composition and Conducting Department in 1991 to study composition under the tutelage of Professor Wang Jianzhong. He teaches in the Composition Department of Middle School Affiliated to Shanghai Conservatory of music and is actively engaged in various fields of composition. His works include symphonies, chamber music, choral music and musicals etc. His distinctive personal style is expressed through diverse genres such as modern, classical, pop, folk, religious and electronic music.</w:t>
       </w:r>
     </w:p>
     <w:p>
@@ -1674,7 +1656,55 @@
           <w:sz w:val="24"/>
           <w:szCs w:val="24"/>
         </w:rPr>
-        <w:t>Singapore’s multi-racial culture left a deep impression on the composer. Born in the southern part of Fujian province but brought up in the Shanghai metropolis, the composer was strongly attracted and took a special liking to Singapore’s rich flavour of a modern metropolis with an eastern China’s cultural atmosphere. The composition emphasises the vibrant, elegant and bustling city life and describes the charms of Nanyang. It depicts scenes of its rich and diverse sentiments, integrated with aspects of traditional Chinese culture. The composer adopts an array of composition techniques with a combination of elements from various influences, including the southern Chinese, western modern, classical and romantic music to reflect the diversity and inner spirit of Singapore.</w:t>
+        <w:t>Singapore</w:t>
+      </w:r>
+      <w:r>
+        <w:rPr>
+          <w:rFonts w:ascii="Noto Serif SC" w:eastAsia="Noto Serif SC" w:hAnsi="Noto Serif SC" w:cs="Noto Serif"/>
+          <w:sz w:val="24"/>
+          <w:szCs w:val="24"/>
+        </w:rPr>
+        <w:t>'</w:t>
+      </w:r>
+      <w:r>
+        <w:rPr>
+          <w:rFonts w:ascii="Noto Serif SC" w:eastAsia="Noto Serif SC" w:hAnsi="Noto Serif SC" w:cs="Noto Serif"/>
+          <w:sz w:val="24"/>
+          <w:szCs w:val="24"/>
+        </w:rPr>
+        <w:t>s multi-racial culture left a deep impression on the composer. Born in the southern part of Fujian province but brought up in the Shanghai metropolis, the composer was strongly attracted and took a special liking to Singapore</w:t>
+      </w:r>
+      <w:r>
+        <w:rPr>
+          <w:rFonts w:ascii="Noto Serif SC" w:eastAsia="Noto Serif SC" w:hAnsi="Noto Serif SC" w:cs="Noto Serif"/>
+          <w:sz w:val="24"/>
+          <w:szCs w:val="24"/>
+        </w:rPr>
+        <w:t>'</w:t>
+      </w:r>
+      <w:r>
+        <w:rPr>
+          <w:rFonts w:ascii="Noto Serif SC" w:eastAsia="Noto Serif SC" w:hAnsi="Noto Serif SC" w:cs="Noto Serif"/>
+          <w:sz w:val="24"/>
+          <w:szCs w:val="24"/>
+        </w:rPr>
+        <w:t>s rich flavour of a modern metropolis with an eastern China</w:t>
+      </w:r>
+      <w:r>
+        <w:rPr>
+          <w:rFonts w:ascii="Noto Serif SC" w:eastAsia="Noto Serif SC" w:hAnsi="Noto Serif SC" w:cs="Noto Serif"/>
+          <w:sz w:val="24"/>
+          <w:szCs w:val="24"/>
+        </w:rPr>
+        <w:t>'</w:t>
+      </w:r>
+      <w:r>
+        <w:rPr>
+          <w:rFonts w:ascii="Noto Serif SC" w:eastAsia="Noto Serif SC" w:hAnsi="Noto Serif SC" w:cs="Noto Serif"/>
+          <w:sz w:val="24"/>
+          <w:szCs w:val="24"/>
+        </w:rPr>
+        <w:t>s cultural atmosphere. The composition emphasises the vibrant, elegant and bustling city life and describes the charms of Nanyang. It depicts scenes of its rich and diverse sentiments, integrated with aspects of traditional Chinese culture. The composer adopts an array of composition techniques with a combination of elements from various influences, including the southern Chinese, western modern, classical and romantic music to reflect the diversity and inner spirit of Singapore.</w:t>
       </w:r>
     </w:p>
     <w:p>

</xml_diff>

<commit_message>
Front Matter update (quotes)
</commit_message>
<xml_diff>
--- a/Front Matter/Template/1_Front-Matter.docx
+++ b/Front Matter/Template/1_Front-Matter.docx
@@ -1566,6 +1566,7 @@
         <w:pBdr>
           <w:bottom w:val="single" w:sz="6" w:space="1" w:color="auto"/>
         </w:pBdr>
+        <w:spacing w:after="240"/>
         <w:jc w:val="both"/>
         <w:rPr>
           <w:rFonts w:ascii="Noto Serif SC" w:eastAsia="Noto Serif SC" w:hAnsi="Noto Serif SC" w:cs="Noto Serif"/>
@@ -1643,6 +1644,7 @@
     </w:p>
     <w:p>
       <w:pPr>
+        <w:spacing w:after="240"/>
         <w:jc w:val="both"/>
         <w:rPr>
           <w:rFonts w:ascii="Noto Serif SC" w:eastAsia="Noto Serif SC" w:hAnsi="Noto Serif SC" w:cs="Noto Serif"/>
@@ -1706,16 +1708,6 @@
         </w:rPr>
         <w:t>s cultural atmosphere. The composition emphasises the vibrant, elegant and bustling city life and describes the charms of Nanyang. It depicts scenes of its rich and diverse sentiments, integrated with aspects of traditional Chinese culture. The composer adopts an array of composition techniques with a combination of elements from various influences, including the southern Chinese, western modern, classical and romantic music to reflect the diversity and inner spirit of Singapore.</w:t>
       </w:r>
-    </w:p>
-    <w:p>
-      <w:pPr>
-        <w:jc w:val="both"/>
-        <w:rPr>
-          <w:rFonts w:ascii="Noto Serif SC" w:eastAsia="Noto Serif SC" w:hAnsi="Noto Serif SC" w:cs="Noto Serif"/>
-          <w:sz w:val="24"/>
-          <w:szCs w:val="24"/>
-        </w:rPr>
-      </w:pPr>
     </w:p>
     <w:p>
       <w:pPr>

</xml_diff>

<commit_message>
Piece 1 and 5 edited (suona instrumentation)
</commit_message>
<xml_diff>
--- a/Front Matter/Template/1_Front-Matter.docx
+++ b/Front Matter/Template/1_Front-Matter.docx
@@ -2175,21 +2175,11 @@
       </w:r>
       <w:r>
         <w:rPr>
-          <w:rFonts w:ascii="Noto Serif SC" w:eastAsia="Noto Serif SC" w:hAnsi="Noto Serif SC" w:cs="Noto Serif" w:hint="eastAsia"/>
-          <w:sz w:val="24"/>
-          <w:szCs w:val="24"/>
-          <w:lang w:val="en-GB"/>
-        </w:rPr>
-        <w:t>高音唢</w:t>
-      </w:r>
-      <w:r>
-        <w:rPr>
-          <w:rFonts w:ascii="Noto Serif SC" w:eastAsia="Noto Serif SC" w:hAnsi="Noto Serif SC" w:cs="Noto Serif" w:hint="eastAsia"/>
-          <w:sz w:val="24"/>
-          <w:szCs w:val="24"/>
-          <w:lang w:val="en-US"/>
-        </w:rPr>
-        <w:t>吶</w:t>
+          <w:rFonts w:ascii="Noto Serif SC" w:eastAsia="Noto Serif SC" w:hAnsi="Noto Serif SC" w:cs="Noto Serif"/>
+          <w:sz w:val="24"/>
+          <w:szCs w:val="24"/>
+        </w:rPr>
+        <w:t>加键高音唢呐</w:t>
       </w:r>
       <w:r>
         <w:rPr>
@@ -2199,6 +2189,15 @@
           <w:lang w:val="en-GB"/>
         </w:rPr>
         <w:t xml:space="preserve">2 </w:t>
+      </w:r>
+      <w:r>
+        <w:rPr>
+          <w:rFonts w:ascii="Noto Serif SC" w:eastAsia="Noto Serif SC" w:hAnsi="Noto Serif SC" w:cs="Noto Serif"/>
+          <w:sz w:val="24"/>
+          <w:szCs w:val="24"/>
+          <w:lang w:val="en-GB"/>
+        </w:rPr>
+        <w:t xml:space="preserve">Keyed </w:t>
       </w:r>
       <w:proofErr w:type="spellStart"/>
       <w:r>
@@ -4208,7 +4207,6 @@
   <w:style w:type="character" w:default="1" w:styleId="DefaultParagraphFont">
     <w:name w:val="Default Paragraph Font"/>
     <w:uiPriority w:val="1"/>
-    <w:semiHidden/>
     <w:unhideWhenUsed/>
   </w:style>
   <w:style w:type="table" w:default="1" w:styleId="TableNormal">

</xml_diff>

<commit_message>
Minor edit to Piece 1 Suona format
</commit_message>
<xml_diff>
--- a/Front Matter/Template/1_Front-Matter.docx
+++ b/Front Matter/Template/1_Front-Matter.docx
@@ -2324,7 +2324,25 @@
           <w:szCs w:val="24"/>
           <w:lang w:val="en-US"/>
         </w:rPr>
-        <w:t>次中唢吶</w:t>
+        <w:t>次中</w:t>
+      </w:r>
+      <w:r>
+        <w:rPr>
+          <w:rFonts w:ascii="Noto Serif SC" w:eastAsia="Noto Serif SC" w:hAnsi="Noto Serif SC" w:cs="Noto Serif" w:hint="eastAsia"/>
+          <w:sz w:val="24"/>
+          <w:szCs w:val="24"/>
+          <w:lang w:val="en-GB"/>
+        </w:rPr>
+        <w:t>音</w:t>
+      </w:r>
+      <w:r>
+        <w:rPr>
+          <w:rFonts w:ascii="Noto Serif SC" w:eastAsia="Noto Serif SC" w:hAnsi="Noto Serif SC" w:cs="Noto Serif" w:hint="eastAsia"/>
+          <w:sz w:val="24"/>
+          <w:szCs w:val="24"/>
+          <w:lang w:val="en-US"/>
+        </w:rPr>
+        <w:t>唢吶</w:t>
       </w:r>
       <w:r>
         <w:rPr>
@@ -4207,6 +4225,7 @@
   <w:style w:type="character" w:default="1" w:styleId="DefaultParagraphFont">
     <w:name w:val="Default Paragraph Font"/>
     <w:uiPriority w:val="1"/>
+    <w:semiHidden/>
     <w:unhideWhenUsed/>
   </w:style>
   <w:style w:type="table" w:default="1" w:styleId="TableNormal">

</xml_diff>

<commit_message>
Updated to Front Matter, fixes to Piece 3 Suona and Tubaphone
</commit_message>
<xml_diff>
--- a/Front Matter/Template/1_Front-Matter.docx
+++ b/Front Matter/Template/1_Front-Matter.docx
@@ -152,15 +152,16 @@
           <w:sz w:val="40"/>
           <w:szCs w:val="96"/>
         </w:rPr>
-        <w:t>Xie Xiang</w:t>
-      </w:r>
+        <w:t xml:space="preserve">Xie </w:t>
+      </w:r>
+      <w:proofErr w:type="spellStart"/>
       <w:r>
         <w:rPr>
           <w:rFonts w:ascii="Noto Serif SC" w:eastAsia="Noto Serif SC" w:hAnsi="Noto Serif SC" w:cs="Noto Serif"/>
           <w:sz w:val="40"/>
           <w:szCs w:val="96"/>
         </w:rPr>
-        <w:t xml:space="preserve"> M</w:t>
+        <w:t>Xiang</w:t>
       </w:r>
       <w:r>
         <w:rPr>
@@ -168,8 +169,17 @@
           <w:sz w:val="40"/>
           <w:szCs w:val="96"/>
         </w:rPr>
+        <w:t>m</w:t>
+      </w:r>
+      <w:r>
+        <w:rPr>
+          <w:rFonts w:ascii="Noto Serif SC" w:eastAsia="Noto Serif SC" w:hAnsi="Noto Serif SC" w:cs="Noto Serif"/>
+          <w:sz w:val="40"/>
+          <w:szCs w:val="96"/>
+        </w:rPr>
         <w:t>ing</w:t>
       </w:r>
+      <w:proofErr w:type="spellEnd"/>
     </w:p>
     <w:p>
       <w:pPr>
@@ -267,7 +277,7 @@
           <w:headerReference w:type="default" r:id="rId9"/>
           <w:footerReference w:type="default" r:id="rId10"/>
           <w:pgSz w:w="16840" w:h="23820"/>
-          <w:pgMar w:top="1440" w:right="1800" w:bottom="1440" w:left="1800" w:header="706" w:footer="1411" w:gutter="0"/>
+          <w:pgMar w:top="1418" w:right="1418" w:bottom="1418" w:left="1588" w:header="706" w:footer="1411" w:gutter="0"/>
           <w:cols w:space="708"/>
           <w:docGrid w:linePitch="360"/>
         </w:sectPr>
@@ -289,7 +299,7 @@
         </w:rPr>
         <w:sectPr>
           <w:pgSz w:w="16840" w:h="23820"/>
-          <w:pgMar w:top="1440" w:right="1800" w:bottom="1440" w:left="1800" w:header="708" w:footer="1417" w:gutter="0"/>
+          <w:pgMar w:top="1418" w:right="1418" w:bottom="1418" w:left="1588" w:header="708" w:footer="1417" w:gutter="0"/>
           <w:cols w:space="708"/>
           <w:titlePg/>
           <w:docGrid w:linePitch="360"/>
@@ -524,7 +534,7 @@
           <w:sz w:val="40"/>
           <w:szCs w:val="96"/>
         </w:rPr>
-        <w:t xml:space="preserve"> M</w:t>
+        <w:t>m</w:t>
       </w:r>
       <w:r>
         <w:rPr>
@@ -567,7 +577,7 @@
         </w:rPr>
         <w:sectPr>
           <w:pgSz w:w="16840" w:h="23820"/>
-          <w:pgMar w:top="1440" w:right="1800" w:bottom="1440" w:left="1800" w:header="708" w:footer="1417" w:gutter="0"/>
+          <w:pgMar w:top="1418" w:right="1418" w:bottom="1418" w:left="1588" w:header="708" w:footer="1417" w:gutter="0"/>
           <w:cols w:space="708"/>
           <w:titlePg/>
           <w:docGrid w:linePitch="360"/>
@@ -1212,7 +1222,7 @@
         </w:rPr>
         <w:sectPr>
           <w:pgSz w:w="16840" w:h="23820"/>
-          <w:pgMar w:top="1440" w:right="1800" w:bottom="1440" w:left="1800" w:header="708" w:footer="1417" w:gutter="0"/>
+          <w:pgMar w:top="1418" w:right="1418" w:bottom="1418" w:left="1588" w:header="708" w:footer="1417" w:gutter="0"/>
           <w:cols w:space="708"/>
           <w:titlePg/>
           <w:docGrid w:linePitch="360"/>
@@ -1524,7 +1534,7 @@
         </w:rPr>
         <w:sectPr>
           <w:pgSz w:w="16840" w:h="23820"/>
-          <w:pgMar w:top="1440" w:right="1800" w:bottom="1440" w:left="1800" w:header="706" w:footer="1411" w:gutter="0"/>
+          <w:pgMar w:top="1418" w:right="1418" w:bottom="1418" w:left="1588" w:header="706" w:footer="1411" w:gutter="0"/>
           <w:cols w:space="708"/>
           <w:titlePg/>
           <w:docGrid w:linePitch="360"/>
@@ -3617,7 +3627,7 @@
     </w:p>
     <w:sectPr>
       <w:pgSz w:w="16840" w:h="23820"/>
-      <w:pgMar w:top="1440" w:right="1800" w:bottom="1440" w:left="1800" w:header="708" w:footer="1417" w:gutter="0"/>
+      <w:pgMar w:top="1418" w:right="1418" w:bottom="1418" w:left="1588" w:header="709" w:footer="1418" w:gutter="0"/>
       <w:cols w:space="708"/>
       <w:titlePg/>
       <w:docGrid w:linePitch="360"/>

</xml_diff>